<commit_message>
Rename Class Test assessment tool to CA in CSE 3251 draft
</commit_message>
<xml_diff>
--- a/57-CSE 3251_U.docx
+++ b/57-CSE 3251_U.docx
@@ -1,6 +1,6 @@
 
 <file path=word/document.xml><?xml version="1.0" encoding="utf-8"?>
-<w:document xmlns:wpc="http://schemas.microsoft.com/office/word/2010/wordprocessingCanvas" xmlns:mc="http://schemas.openxmlformats.org/markup-compatibility/2006" xmlns:o="urn:schemas-microsoft-com:office:office" xmlns:r="http://schemas.openxmlformats.org/officeDocument/2006/relationships" xmlns:m="http://schemas.openxmlformats.org/officeDocument/2006/math" xmlns:v="urn:schemas-microsoft-com:vml" xmlns:wp14="http://schemas.microsoft.com/office/word/2010/wordprocessingDrawing" xmlns:wp="http://schemas.openxmlformats.org/drawingml/2006/wordprocessingDrawing" xmlns:w10="urn:schemas-microsoft-com:office:word" xmlns:w="http://schemas.openxmlformats.org/wordprocessingml/2006/main" xmlns:w14="http://schemas.microsoft.com/office/word/2010/wordml" xmlns:w15="http://schemas.microsoft.com/office/word/2012/wordml" xmlns:wpg="http://schemas.microsoft.com/office/word/2010/wordprocessingGroup" xmlns:wpi="http://schemas.microsoft.com/office/word/2010/wordprocessingInk" xmlns:wne="http://schemas.microsoft.com/office/word/2006/wordml" xmlns:wps="http://schemas.microsoft.com/office/word/2010/wordprocessingShape" mc:Ignorable="w14 w15 wp14">
+<w:document xmlns:wpc="http://schemas.microsoft.com/office/word/2010/wordprocessingCanvas" xmlns:cx="http://schemas.microsoft.com/office/drawing/2014/chartex" xmlns:cx1="http://schemas.microsoft.com/office/drawing/2015/9/8/chartex" xmlns:cx2="http://schemas.microsoft.com/office/drawing/2015/10/21/chartex" xmlns:cx3="http://schemas.microsoft.com/office/drawing/2016/5/9/chartex" xmlns:cx4="http://schemas.microsoft.com/office/drawing/2016/5/10/chartex" xmlns:cx5="http://schemas.microsoft.com/office/drawing/2016/5/11/chartex" xmlns:cx6="http://schemas.microsoft.com/office/drawing/2016/5/12/chartex" xmlns:cx7="http://schemas.microsoft.com/office/drawing/2016/5/13/chartex" xmlns:cx8="http://schemas.microsoft.com/office/drawing/2016/5/14/chartex" xmlns:mc="http://schemas.openxmlformats.org/markup-compatibility/2006" xmlns:m="http://schemas.openxmlformats.org/officeDocument/2006/math" xmlns:aink="http://schemas.microsoft.com/office/drawing/2016/ink" xmlns:am3d="http://schemas.microsoft.com/office/drawing/2017/model3d" xmlns:oel="http://schemas.microsoft.com/office/2019/extlst" xmlns:r="http://schemas.openxmlformats.org/officeDocument/2006/relationships" xmlns:wp14="http://schemas.microsoft.com/office/word/2010/wordprocessingDrawing" xmlns:wp="http://schemas.openxmlformats.org/drawingml/2006/wordprocessingDrawing" xmlns:wpg="http://schemas.microsoft.com/office/word/2010/wordprocessingGroup" xmlns:wpi="http://schemas.microsoft.com/office/word/2010/wordprocessingInk" xmlns:wps="http://schemas.microsoft.com/office/word/2010/wordprocessingShape" xmlns:o="urn:schemas-microsoft-com:office:office" xmlns:v="urn:schemas-microsoft-com:vml" xmlns:w10="urn:schemas-microsoft-com:office:word" xmlns:w="http://schemas.openxmlformats.org/wordprocessingml/2006/main" xmlns:w14="http://schemas.microsoft.com/office/word/2010/wordml" xmlns:w15="http://schemas.microsoft.com/office/word/2012/wordml" xmlns:w16cex="http://schemas.microsoft.com/office/word/2018/wordml/cex" xmlns:w16cid="http://schemas.microsoft.com/office/word/2016/wordml/cid" xmlns:w16="http://schemas.microsoft.com/office/word/2018/wordml" xmlns:w16sdtdh="http://schemas.microsoft.com/office/word/2020/wordml/sdtdatahash" xmlns:w16sdtfl="http://schemas.microsoft.com/office/word/2024/wordml/sdtformatlock" xmlns:w16se="http://schemas.microsoft.com/office/word/2015/wordml/symex" xmlns:w16du="http://schemas.microsoft.com/office/word/2023/wordml/word16du" xmlns:wne="http://schemas.microsoft.com/office/word/2006/wordml" mc:Ignorable="w14 w15 w16se w16cid w16 w16cex w16sdtdh w16sdtfl w16du wp14">
   <w:body>
     <w:p>
       <w:pPr>
@@ -362,7 +362,6 @@
                 </w:rPr>
                 <w:id w:val="-794673430"/>
               </w:sdtPr>
-              <w:sdtEndPr/>
               <w:sdtContent>
                 <w:r>
                   <w:rPr>
@@ -394,7 +393,6 @@
                 </w:rPr>
                 <w:id w:val="-210957728"/>
               </w:sdtPr>
-              <w:sdtEndPr/>
               <w:sdtContent>
                 <w:r>
                   <w:rPr>
@@ -426,7 +424,6 @@
                 </w:rPr>
                 <w:id w:val="1107150976"/>
               </w:sdtPr>
-              <w:sdtEndPr/>
               <w:sdtContent>
                 <w:r>
                   <w:rPr>
@@ -458,7 +455,6 @@
                 </w:rPr>
                 <w:id w:val="1207141489"/>
               </w:sdtPr>
-              <w:sdtEndPr/>
               <w:sdtContent>
                 <w:r>
                   <w:rPr>
@@ -600,9 +596,9 @@
                 <w:sz w:val="18"/>
                 <w:szCs w:val="18"/>
               </w:rPr>
-              <w:t xml:space="preserve">This course introduces Web Engineering as a systematic process for designing, analyzing, and evaluating modern web applications. Students will study foundational web engineering concepts, REST API design, modern web architecture, web security, testing, </w:t>
-            </w:r>
-            <w:proofErr w:type="gramStart"/>
+              <w:t xml:space="preserve">This course introduces Web Engineering as a systematic process for designing, analyzing, and evaluating modern web applications. Students will study foundational web engineering concepts, REST API design, modern web architecture, web security, testing, scalability, containerization, and CI/CD practices. The companion lab course (CSE 3252) provides hands-on implementation using Express.js, </w:t>
+            </w:r>
+            <w:proofErr w:type="spellStart"/>
             <w:r>
               <w:rPr>
                 <w:rFonts w:ascii="Arial" w:hAnsi="Arial" w:cs="Arial"/>
@@ -610,9 +606,9 @@
                 <w:sz w:val="18"/>
                 <w:szCs w:val="18"/>
               </w:rPr>
-              <w:t>scalability</w:t>
-            </w:r>
-            <w:proofErr w:type="gramEnd"/>
+              <w:t>AdonisJS</w:t>
+            </w:r>
+            <w:proofErr w:type="spellEnd"/>
             <w:r>
               <w:rPr>
                 <w:rFonts w:ascii="Arial" w:hAnsi="Arial" w:cs="Arial"/>
@@ -620,47 +616,7 @@
                 <w:sz w:val="18"/>
                 <w:szCs w:val="18"/>
               </w:rPr>
-              <w:t xml:space="preserve">, containerization, and CI/CD practices. The companion lab course (CSE 3252) provides hands-on implementation using Express.js, </w:t>
-            </w:r>
-            <w:proofErr w:type="spellStart"/>
-            <w:r>
-              <w:rPr>
-                <w:rFonts w:ascii="Arial" w:hAnsi="Arial" w:cs="Arial"/>
-                <w:iCs/>
-                <w:sz w:val="18"/>
-                <w:szCs w:val="18"/>
-              </w:rPr>
-              <w:t>AdonisJS</w:t>
-            </w:r>
-            <w:proofErr w:type="spellEnd"/>
-            <w:r>
-              <w:rPr>
-                <w:rFonts w:ascii="Arial" w:hAnsi="Arial" w:cs="Arial"/>
-                <w:iCs/>
-                <w:sz w:val="18"/>
-                <w:szCs w:val="18"/>
-              </w:rPr>
-              <w:t xml:space="preserve">, and/or </w:t>
-            </w:r>
-            <w:proofErr w:type="spellStart"/>
-            <w:r>
-              <w:rPr>
-                <w:rFonts w:ascii="Arial" w:hAnsi="Arial" w:cs="Arial"/>
-                <w:iCs/>
-                <w:sz w:val="18"/>
-                <w:szCs w:val="18"/>
-              </w:rPr>
-              <w:t>Laravel</w:t>
-            </w:r>
-            <w:proofErr w:type="spellEnd"/>
-            <w:r>
-              <w:rPr>
-                <w:rFonts w:ascii="Arial" w:hAnsi="Arial" w:cs="Arial"/>
-                <w:iCs/>
-                <w:sz w:val="18"/>
-                <w:szCs w:val="18"/>
-              </w:rPr>
-              <w:t>.</w:t>
+              <w:t>, and/or Laravel.</w:t>
             </w:r>
           </w:p>
         </w:tc>
@@ -1208,7 +1164,6 @@
                 </w:rPr>
                 <w:id w:val="-53020217"/>
               </w:sdtPr>
-              <w:sdtEndPr/>
               <w:sdtContent>
                 <w:r>
                   <w:rPr>
@@ -1251,7 +1206,6 @@
                 </w:rPr>
                 <w:id w:val="-1003431211"/>
               </w:sdtPr>
-              <w:sdtEndPr/>
               <w:sdtContent>
                 <w:r>
                   <w:rPr>
@@ -1294,7 +1248,6 @@
                 </w:rPr>
                 <w:id w:val="-2144335225"/>
               </w:sdtPr>
-              <w:sdtEndPr/>
               <w:sdtContent>
                 <w:r>
                   <w:rPr>
@@ -1337,7 +1290,6 @@
                 </w:rPr>
                 <w:id w:val="890849217"/>
               </w:sdtPr>
-              <w:sdtEndPr/>
               <w:sdtContent>
                 <w:sdt>
                   <w:sdtPr>
@@ -1349,7 +1301,6 @@
                     </w:rPr>
                     <w:id w:val="1548262132"/>
                   </w:sdtPr>
-                  <w:sdtEndPr/>
                   <w:sdtContent>
                     <w:r>
                       <w:rPr>
@@ -1394,7 +1345,6 @@
                 </w:rPr>
                 <w:id w:val="221561843"/>
               </w:sdtPr>
-              <w:sdtEndPr/>
               <w:sdtContent>
                 <w:r>
                   <w:rPr>
@@ -1443,7 +1393,6 @@
                 </w:rPr>
                 <w:id w:val="2000385939"/>
               </w:sdtPr>
-              <w:sdtEndPr/>
               <w:sdtContent>
                 <w:r>
                   <w:rPr>
@@ -1463,7 +1412,7 @@
                 <w:sz w:val="18"/>
                 <w:szCs w:val="18"/>
               </w:rPr>
-              <w:t xml:space="preserve">  Class Test</w:t>
+              <w:t xml:space="preserve">  CA</w:t>
             </w:r>
           </w:p>
           <w:p>
@@ -1486,7 +1435,6 @@
                 </w:rPr>
                 <w:id w:val="-1466270402"/>
               </w:sdtPr>
-              <w:sdtEndPr/>
               <w:sdtContent>
                 <w:r>
                   <w:rPr>
@@ -1529,7 +1477,6 @@
                 </w:rPr>
                 <w:id w:val="172925761"/>
               </w:sdtPr>
-              <w:sdtEndPr/>
               <w:sdtContent>
                 <w:r>
                   <w:rPr>
@@ -1572,7 +1519,6 @@
                 </w:rPr>
                 <w:id w:val="1741370360"/>
               </w:sdtPr>
-              <w:sdtEndPr/>
               <w:sdtContent>
                 <w:r>
                   <w:rPr>
@@ -1615,7 +1561,6 @@
                 </w:rPr>
                 <w:id w:val="-60407307"/>
               </w:sdtPr>
-              <w:sdtEndPr/>
               <w:sdtContent>
                 <w:r>
                   <w:rPr>
@@ -1725,45 +1670,7 @@
                 <w:sz w:val="18"/>
                 <w:szCs w:val="18"/>
               </w:rPr>
-              <w:t xml:space="preserve"> </w:t>
-            </w:r>
-            <w:proofErr w:type="spellStart"/>
-            <w:r>
-              <w:rPr>
-                <w:rFonts w:ascii="Arial" w:hAnsi="Arial" w:cs="Arial"/>
-                <w:color w:val="000000" w:themeColor="text1"/>
-                <w:sz w:val="18"/>
-                <w:szCs w:val="18"/>
-              </w:rPr>
-              <w:t>RESTful</w:t>
-            </w:r>
-            <w:proofErr w:type="spellEnd"/>
-            <w:r>
-              <w:rPr>
-                <w:rFonts w:ascii="Arial" w:hAnsi="Arial" w:cs="Arial"/>
-                <w:color w:val="000000" w:themeColor="text1"/>
-                <w:sz w:val="18"/>
-                <w:szCs w:val="18"/>
-              </w:rPr>
-              <w:t xml:space="preserve"> APIs and modern web architectures, including Single Page Applications and micro</w:t>
-            </w:r>
-            <w:r>
-              <w:rPr>
-                <w:rFonts w:ascii="Arial" w:hAnsi="Arial" w:cs="Arial"/>
-                <w:color w:val="000000" w:themeColor="text1"/>
-                <w:sz w:val="18"/>
-                <w:szCs w:val="18"/>
-              </w:rPr>
-              <w:t xml:space="preserve"/>
-            </w:r>
-            <w:r>
-              <w:rPr>
-                <w:rFonts w:ascii="Arial" w:hAnsi="Arial" w:cs="Arial"/>
-                <w:color w:val="000000" w:themeColor="text1"/>
-                <w:sz w:val="18"/>
-                <w:szCs w:val="18"/>
-              </w:rPr>
-              <w:t>services, that meet specified requirements</w:t>
+              <w:t xml:space="preserve"> RESTful APIs and modern web architectures, including Single Page Applications and microservices, that meet specified requirements</w:t>
             </w:r>
           </w:p>
         </w:tc>
@@ -1909,7 +1816,6 @@
                 </w:rPr>
                 <w:id w:val="-50000107"/>
               </w:sdtPr>
-              <w:sdtEndPr/>
               <w:sdtContent>
                 <w:r>
                   <w:rPr>
@@ -1952,7 +1858,6 @@
                 </w:rPr>
                 <w:id w:val="-620379072"/>
               </w:sdtPr>
-              <w:sdtEndPr/>
               <w:sdtContent>
                 <w:r>
                   <w:rPr>
@@ -1995,7 +1900,6 @@
                 </w:rPr>
                 <w:id w:val="598689794"/>
               </w:sdtPr>
-              <w:sdtEndPr/>
               <w:sdtContent>
                 <w:r>
                   <w:rPr>
@@ -2038,7 +1942,6 @@
                 </w:rPr>
                 <w:id w:val="-815495056"/>
               </w:sdtPr>
-              <w:sdtEndPr/>
               <w:sdtContent>
                 <w:sdt>
                   <w:sdtPr>
@@ -2050,7 +1953,6 @@
                     </w:rPr>
                     <w:id w:val="-1066568578"/>
                   </w:sdtPr>
-                  <w:sdtEndPr/>
                   <w:sdtContent>
                     <w:r>
                       <w:rPr>
@@ -2095,7 +1997,6 @@
                 </w:rPr>
                 <w:id w:val="-2033409301"/>
               </w:sdtPr>
-              <w:sdtEndPr/>
               <w:sdtContent>
                 <w:r>
                   <w:rPr>
@@ -2144,7 +2045,6 @@
                 </w:rPr>
                 <w:id w:val="-1310624530"/>
               </w:sdtPr>
-              <w:sdtEndPr/>
               <w:sdtContent>
                 <w:r>
                   <w:rPr>
@@ -2164,7 +2064,7 @@
                 <w:sz w:val="18"/>
                 <w:szCs w:val="18"/>
               </w:rPr>
-              <w:t xml:space="preserve">  Class Test</w:t>
+              <w:t xml:space="preserve">  CA</w:t>
             </w:r>
           </w:p>
           <w:p>
@@ -2187,7 +2087,6 @@
                 </w:rPr>
                 <w:id w:val="892476431"/>
               </w:sdtPr>
-              <w:sdtEndPr/>
               <w:sdtContent>
                 <w:r>
                   <w:rPr>
@@ -2230,7 +2129,6 @@
                 </w:rPr>
                 <w:id w:val="-1366665986"/>
               </w:sdtPr>
-              <w:sdtEndPr/>
               <w:sdtContent>
                 <w:r>
                   <w:rPr>
@@ -2273,7 +2171,6 @@
                 </w:rPr>
                 <w:id w:val="-482855587"/>
               </w:sdtPr>
-              <w:sdtEndPr/>
               <w:sdtContent>
                 <w:r>
                   <w:rPr>
@@ -2316,7 +2213,6 @@
                 </w:rPr>
                 <w:id w:val="-2067172492"/>
               </w:sdtPr>
-              <w:sdtEndPr/>
               <w:sdtContent>
                 <w:r>
                   <w:rPr>
@@ -2409,7 +2305,6 @@
               </w:rPr>
               <w:t xml:space="preserve">To </w:t>
             </w:r>
-            <w:proofErr w:type="spellStart"/>
             <w:r>
               <w:rPr>
                 <w:rFonts w:ascii="Arial" w:hAnsi="Arial" w:cs="Arial"/>
@@ -2420,7 +2315,6 @@
               </w:rPr>
               <w:t>evaluate</w:t>
             </w:r>
-            <w:proofErr w:type="spellEnd"/>
             <w:r>
               <w:rPr>
                 <w:rFonts w:ascii="Arial" w:hAnsi="Arial" w:cs="Arial"/>
@@ -2630,7 +2524,6 @@
                 </w:rPr>
                 <w:id w:val="-995027337"/>
               </w:sdtPr>
-              <w:sdtEndPr/>
               <w:sdtContent>
                 <w:r>
                   <w:rPr>
@@ -2673,7 +2566,6 @@
                 </w:rPr>
                 <w:id w:val="244301697"/>
               </w:sdtPr>
-              <w:sdtEndPr/>
               <w:sdtContent>
                 <w:r>
                   <w:rPr>
@@ -2716,7 +2608,6 @@
                 </w:rPr>
                 <w:id w:val="404426894"/>
               </w:sdtPr>
-              <w:sdtEndPr/>
               <w:sdtContent>
                 <w:r>
                   <w:rPr>
@@ -2759,7 +2650,6 @@
                 </w:rPr>
                 <w:id w:val="1412432412"/>
               </w:sdtPr>
-              <w:sdtEndPr/>
               <w:sdtContent>
                 <w:sdt>
                   <w:sdtPr>
@@ -2771,7 +2661,6 @@
                     </w:rPr>
                     <w:id w:val="1731274858"/>
                   </w:sdtPr>
-                  <w:sdtEndPr/>
                   <w:sdtContent>
                     <w:r>
                       <w:rPr>
@@ -2816,7 +2705,6 @@
                 </w:rPr>
                 <w:id w:val="995923622"/>
               </w:sdtPr>
-              <w:sdtEndPr/>
               <w:sdtContent>
                 <w:r>
                   <w:rPr>
@@ -2865,7 +2753,6 @@
                 </w:rPr>
                 <w:id w:val="914520921"/>
               </w:sdtPr>
-              <w:sdtEndPr/>
               <w:sdtContent>
                 <w:r>
                   <w:rPr>
@@ -2885,7 +2772,7 @@
                 <w:sz w:val="18"/>
                 <w:szCs w:val="18"/>
               </w:rPr>
-              <w:t xml:space="preserve">  Class Test</w:t>
+              <w:t xml:space="preserve">  CA</w:t>
             </w:r>
           </w:p>
           <w:p>
@@ -2908,17 +2795,29 @@
                 </w:rPr>
                 <w:id w:val="1915661309"/>
               </w:sdtPr>
-              <w:sdtEndPr/>
               <w:sdtContent>
-                <w:r>
-                  <w:rPr>
-                    <w:rFonts w:ascii="MS Gothic" w:eastAsia="MS Gothic" w:hAnsi="MS Gothic" w:cs="MS Gothic" w:hint="eastAsia"/>
-                    <w:color w:val="000000" w:themeColor="text1"/>
-                    <w:sz w:val="18"/>
-                    <w:szCs w:val="18"/>
-                  </w:rPr>
-                  <w:t>☒</w:t>
-                </w:r>
+                <w:sdt>
+                  <w:sdtPr>
+                    <w:rPr>
+                      <w:rFonts w:ascii="Arial" w:hAnsi="Arial" w:cs="Arial"/>
+                      <w:color w:val="000000" w:themeColor="text1"/>
+                      <w:sz w:val="18"/>
+                      <w:szCs w:val="18"/>
+                    </w:rPr>
+                    <w:id w:val="418914749"/>
+                  </w:sdtPr>
+                  <w:sdtContent>
+                    <w:r>
+                      <w:rPr>
+                        <w:rFonts w:ascii="MS Gothic" w:eastAsia="MS Gothic" w:hAnsi="MS Gothic" w:cs="MS Gothic" w:hint="eastAsia"/>
+                        <w:color w:val="000000" w:themeColor="text1"/>
+                        <w:sz w:val="18"/>
+                        <w:szCs w:val="18"/>
+                      </w:rPr>
+                      <w:t>☐</w:t>
+                    </w:r>
+                  </w:sdtContent>
+                </w:sdt>
               </w:sdtContent>
             </w:sdt>
             <w:r>
@@ -2951,563 +2850,6 @@
                 </w:rPr>
                 <w:id w:val="1950893002"/>
               </w:sdtPr>
-              <w:sdtEndPr/>
-              <w:sdtContent>
-                <w:r>
-                  <w:rPr>
-                    <w:rFonts w:ascii="MS Gothic" w:eastAsia="MS Gothic" w:hAnsi="MS Gothic" w:cs="MS Gothic" w:hint="eastAsia"/>
-                    <w:color w:val="000000" w:themeColor="text1"/>
-                    <w:sz w:val="18"/>
-                    <w:szCs w:val="18"/>
-                  </w:rPr>
-                  <w:t>☐</w:t>
-                </w:r>
-              </w:sdtContent>
-            </w:sdt>
-            <w:r>
-              <w:rPr>
-                <w:rFonts w:ascii="Arial" w:hAnsi="Arial" w:cs="Arial"/>
-                <w:color w:val="000000" w:themeColor="text1"/>
-                <w:sz w:val="18"/>
-                <w:szCs w:val="18"/>
-              </w:rPr>
-              <w:t xml:space="preserve">  Assignment </w:t>
-            </w:r>
-          </w:p>
-          <w:p>
-            <w:pPr>
-              <w:spacing w:line="276" w:lineRule="auto"/>
-              <w:rPr>
-                <w:rFonts w:ascii="Arial" w:hAnsi="Arial" w:cs="Arial"/>
-                <w:color w:val="000000" w:themeColor="text1"/>
-                <w:sz w:val="18"/>
-                <w:szCs w:val="18"/>
-              </w:rPr>
-            </w:pPr>
-            <w:sdt>
-              <w:sdtPr>
-                <w:rPr>
-                  <w:rFonts w:ascii="Arial" w:hAnsi="Arial" w:cs="Arial"/>
-                  <w:color w:val="000000" w:themeColor="text1"/>
-                  <w:sz w:val="18"/>
-                  <w:szCs w:val="18"/>
-                </w:rPr>
-                <w:id w:val="-339551353"/>
-              </w:sdtPr>
-              <w:sdtEndPr/>
-              <w:sdtContent>
-                <w:r>
-                  <w:rPr>
-                    <w:rFonts w:ascii="MS Gothic" w:eastAsia="MS Gothic" w:hAnsi="MS Gothic" w:cs="MS Gothic" w:hint="eastAsia"/>
-                    <w:color w:val="000000" w:themeColor="text1"/>
-                    <w:sz w:val="18"/>
-                    <w:szCs w:val="18"/>
-                  </w:rPr>
-                  <w:t>☐</w:t>
-                </w:r>
-              </w:sdtContent>
-            </w:sdt>
-            <w:r>
-              <w:rPr>
-                <w:rFonts w:ascii="Arial" w:hAnsi="Arial" w:cs="Arial"/>
-                <w:color w:val="000000" w:themeColor="text1"/>
-                <w:sz w:val="18"/>
-                <w:szCs w:val="18"/>
-              </w:rPr>
-              <w:t xml:space="preserve">  Participation</w:t>
-            </w:r>
-          </w:p>
-          <w:p>
-            <w:pPr>
-              <w:spacing w:line="216" w:lineRule="auto"/>
-              <w:rPr>
-                <w:rFonts w:ascii="Arial" w:hAnsi="Arial" w:cs="Arial"/>
-                <w:color w:val="000000" w:themeColor="text1"/>
-                <w:sz w:val="18"/>
-                <w:szCs w:val="18"/>
-              </w:rPr>
-            </w:pPr>
-            <w:sdt>
-              <w:sdtPr>
-                <w:rPr>
-                  <w:rFonts w:ascii="Arial" w:hAnsi="Arial" w:cs="Arial"/>
-                  <w:color w:val="000000" w:themeColor="text1"/>
-                  <w:sz w:val="18"/>
-                  <w:szCs w:val="18"/>
-                </w:rPr>
-                <w:id w:val="934787324"/>
-              </w:sdtPr>
-              <w:sdtEndPr/>
-              <w:sdtContent>
-                <w:r>
-                  <w:rPr>
-                    <w:rFonts w:ascii="MS Gothic" w:eastAsia="MS Gothic" w:hAnsi="MS Gothic" w:cs="MS Gothic" w:hint="eastAsia"/>
-                    <w:color w:val="000000" w:themeColor="text1"/>
-                    <w:sz w:val="18"/>
-                    <w:szCs w:val="18"/>
-                  </w:rPr>
-                  <w:t>☐</w:t>
-                </w:r>
-              </w:sdtContent>
-            </w:sdt>
-            <w:r>
-              <w:rPr>
-                <w:rFonts w:ascii="Arial" w:hAnsi="Arial" w:cs="Arial"/>
-                <w:color w:val="000000" w:themeColor="text1"/>
-                <w:sz w:val="18"/>
-                <w:szCs w:val="18"/>
-              </w:rPr>
-              <w:t xml:space="preserve">  Presentation</w:t>
-            </w:r>
-          </w:p>
-        </w:tc>
-      </w:tr>
-      <w:tr>
-        <w:trPr>
-          <w:trHeight w:val="1448"/>
-          <w:jc w:val="center"/>
-        </w:trPr>
-        <w:tc>
-          <w:tcPr>
-            <w:tcW w:w="715" w:type="dxa"/>
-            <w:vAlign w:val="center"/>
-          </w:tcPr>
-          <w:p>
-            <w:pPr>
-              <w:spacing w:line="216" w:lineRule="auto"/>
-              <w:jc w:val="center"/>
-              <w:rPr>
-                <w:rFonts w:ascii="Arial" w:hAnsi="Arial" w:cs="Arial"/>
-                <w:color w:val="000000" w:themeColor="text1"/>
-                <w:sz w:val="18"/>
-                <w:szCs w:val="18"/>
-              </w:rPr>
-            </w:pPr>
-            <w:r>
-              <w:rPr>
-                <w:rFonts w:ascii="Arial" w:hAnsi="Arial" w:cs="Arial"/>
-                <w:color w:val="000000" w:themeColor="text1"/>
-                <w:sz w:val="18"/>
-                <w:szCs w:val="18"/>
-              </w:rPr>
-              <w:t>CO4</w:t>
-            </w:r>
-          </w:p>
-        </w:tc>
-        <w:tc>
-          <w:tcPr>
-            <w:tcW w:w="2160" w:type="dxa"/>
-          </w:tcPr>
-          <w:p>
-            <w:pPr>
-              <w:spacing w:line="216" w:lineRule="auto"/>
-              <w:jc w:val="center"/>
-              <w:rPr>
-                <w:rFonts w:ascii="Arial" w:hAnsi="Arial" w:cs="Arial"/>
-                <w:color w:val="000000" w:themeColor="text1"/>
-                <w:sz w:val="18"/>
-                <w:szCs w:val="18"/>
-              </w:rPr>
-            </w:pPr>
-          </w:p>
-          <w:p>
-            <w:pPr>
-              <w:spacing w:line="216" w:lineRule="auto"/>
-              <w:jc w:val="center"/>
-              <w:rPr>
-                <w:rFonts w:ascii="Arial" w:hAnsi="Arial" w:cs="Arial"/>
-                <w:color w:val="000000" w:themeColor="text1"/>
-                <w:sz w:val="18"/>
-                <w:szCs w:val="18"/>
-              </w:rPr>
-            </w:pPr>
-            <w:r>
-              <w:rPr>
-                <w:rFonts w:ascii="Arial" w:hAnsi="Arial" w:cs="Arial"/>
-                <w:color w:val="000000" w:themeColor="text1"/>
-                <w:sz w:val="18"/>
-                <w:szCs w:val="18"/>
-              </w:rPr>
-              <w:t xml:space="preserve">To </w:t>
-            </w:r>
-            <w:r>
-              <w:rPr>
-                <w:rFonts w:ascii="Arial" w:hAnsi="Arial" w:cs="Arial"/>
-                <w:b/>
-                <w:color w:val="000000" w:themeColor="text1"/>
-                <w:sz w:val="18"/>
-                <w:szCs w:val="18"/>
-              </w:rPr>
-              <w:t>compare</w:t>
-            </w:r>
-            <w:r>
-              <w:rPr>
-                <w:rFonts w:ascii="Arial" w:hAnsi="Arial" w:cs="Arial"/>
-                <w:color w:val="000000" w:themeColor="text1"/>
-                <w:sz w:val="18"/>
-                <w:szCs w:val="18"/>
-              </w:rPr>
-              <w:t xml:space="preserve"> scalability strategies, </w:t>
-            </w:r>
-            <w:proofErr w:type="spellStart"/>
-            <w:r>
-              <w:rPr>
-                <w:rFonts w:ascii="Arial" w:hAnsi="Arial" w:cs="Arial"/>
-                <w:color w:val="000000" w:themeColor="text1"/>
-                <w:sz w:val="18"/>
-                <w:szCs w:val="18"/>
-              </w:rPr>
-              <w:t>Docker</w:t>
-            </w:r>
-            <w:proofErr w:type="spellEnd"/>
-            <w:r>
-              <w:rPr>
-                <w:rFonts w:ascii="Arial" w:hAnsi="Arial" w:cs="Arial"/>
-                <w:color w:val="000000" w:themeColor="text1"/>
-                <w:sz w:val="18"/>
-                <w:szCs w:val="18"/>
-              </w:rPr>
-              <w:t xml:space="preserve">-based </w:t>
-            </w:r>
-            <w:proofErr w:type="spellStart"/>
-            <w:r>
-              <w:rPr>
-                <w:rFonts w:ascii="Arial" w:hAnsi="Arial" w:cs="Arial"/>
-                <w:color w:val="000000" w:themeColor="text1"/>
-                <w:sz w:val="18"/>
-                <w:szCs w:val="18"/>
-              </w:rPr>
-              <w:t>containerization</w:t>
-            </w:r>
-            <w:proofErr w:type="spellEnd"/>
-            <w:r>
-              <w:rPr>
-                <w:rFonts w:ascii="Arial" w:hAnsi="Arial" w:cs="Arial"/>
-                <w:color w:val="000000" w:themeColor="text1"/>
-                <w:sz w:val="18"/>
-                <w:szCs w:val="18"/>
-              </w:rPr>
-              <w:t>, and CI/CD pipeline approaches for production web systems</w:t>
-            </w:r>
-          </w:p>
-        </w:tc>
-        <w:tc>
-          <w:tcPr>
-            <w:tcW w:w="1530" w:type="dxa"/>
-          </w:tcPr>
-          <w:p>
-            <w:pPr>
-              <w:spacing w:line="216" w:lineRule="auto"/>
-              <w:jc w:val="center"/>
-              <w:rPr>
-                <w:rFonts w:ascii="Arial" w:hAnsi="Arial" w:cs="Arial"/>
-                <w:color w:val="000000" w:themeColor="text1"/>
-                <w:sz w:val="18"/>
-                <w:szCs w:val="18"/>
-              </w:rPr>
-            </w:pPr>
-          </w:p>
-          <w:p>
-            <w:pPr>
-              <w:spacing w:line="216" w:lineRule="auto"/>
-              <w:jc w:val="center"/>
-              <w:rPr>
-                <w:rFonts w:ascii="Arial" w:hAnsi="Arial" w:cs="Arial"/>
-                <w:color w:val="000000" w:themeColor="text1"/>
-                <w:sz w:val="18"/>
-                <w:szCs w:val="18"/>
-              </w:rPr>
-            </w:pPr>
-          </w:p>
-          <w:p>
-            <w:pPr>
-              <w:spacing w:line="216" w:lineRule="auto"/>
-              <w:jc w:val="center"/>
-              <w:rPr>
-                <w:rFonts w:ascii="Arial" w:hAnsi="Arial" w:cs="Arial"/>
-                <w:color w:val="000000" w:themeColor="text1"/>
-                <w:sz w:val="18"/>
-                <w:szCs w:val="18"/>
-              </w:rPr>
-            </w:pPr>
-            <w:r>
-              <w:rPr>
-                <w:rFonts w:ascii="Arial" w:hAnsi="Arial" w:cs="Arial"/>
-                <w:b/>
-                <w:color w:val="000000" w:themeColor="text1"/>
-                <w:sz w:val="18"/>
-                <w:szCs w:val="18"/>
-              </w:rPr>
-              <w:t>Modern Tool Usage</w:t>
-            </w:r>
-            <w:r>
-              <w:rPr>
-                <w:rFonts w:ascii="Arial" w:hAnsi="Arial" w:cs="Arial"/>
-                <w:b/>
-                <w:color w:val="000000" w:themeColor="text1"/>
-                <w:sz w:val="18"/>
-                <w:szCs w:val="18"/>
-              </w:rPr>
-              <w:t>:</w:t>
-            </w:r>
-            <w:r>
-              <w:rPr>
-                <w:rFonts w:ascii="Arial" w:hAnsi="Arial" w:cs="Arial"/>
-                <w:color w:val="000000" w:themeColor="text1"/>
-                <w:sz w:val="18"/>
-                <w:szCs w:val="18"/>
-              </w:rPr>
-              <w:t xml:space="preserve"> </w:t>
-            </w:r>
-          </w:p>
-          <w:p>
-            <w:pPr>
-              <w:spacing w:line="216" w:lineRule="auto"/>
-              <w:jc w:val="center"/>
-              <w:rPr>
-                <w:rFonts w:ascii="Arial" w:hAnsi="Arial" w:cs="Arial"/>
-                <w:color w:val="000000" w:themeColor="text1"/>
-                <w:sz w:val="18"/>
-                <w:szCs w:val="18"/>
-              </w:rPr>
-            </w:pPr>
-            <w:r>
-              <w:rPr>
-                <w:rFonts w:ascii="Arial" w:hAnsi="Arial" w:cs="Arial"/>
-                <w:color w:val="000000" w:themeColor="text1"/>
-                <w:sz w:val="18"/>
-                <w:szCs w:val="18"/>
-              </w:rPr>
-              <w:t>(PO5)</w:t>
-            </w:r>
-          </w:p>
-        </w:tc>
-        <w:tc>
-          <w:tcPr>
-            <w:tcW w:w="1440" w:type="dxa"/>
-          </w:tcPr>
-          <w:p>
-            <w:pPr>
-              <w:spacing w:line="216" w:lineRule="auto"/>
-              <w:jc w:val="center"/>
-              <w:rPr>
-                <w:rFonts w:ascii="Arial" w:hAnsi="Arial" w:cs="Arial"/>
-                <w:color w:val="000000" w:themeColor="text1"/>
-                <w:sz w:val="18"/>
-                <w:szCs w:val="18"/>
-              </w:rPr>
-            </w:pPr>
-          </w:p>
-          <w:p>
-            <w:pPr>
-              <w:spacing w:line="216" w:lineRule="auto"/>
-              <w:jc w:val="center"/>
-              <w:rPr>
-                <w:rFonts w:ascii="Arial" w:hAnsi="Arial" w:cs="Arial"/>
-                <w:color w:val="000000" w:themeColor="text1"/>
-                <w:sz w:val="18"/>
-                <w:szCs w:val="18"/>
-              </w:rPr>
-            </w:pPr>
-          </w:p>
-          <w:p>
-            <w:pPr>
-              <w:spacing w:line="216" w:lineRule="auto"/>
-              <w:jc w:val="center"/>
-              <w:rPr>
-                <w:rFonts w:ascii="Arial" w:hAnsi="Arial" w:cs="Arial"/>
-                <w:color w:val="000000" w:themeColor="text1"/>
-                <w:sz w:val="18"/>
-                <w:szCs w:val="18"/>
-              </w:rPr>
-            </w:pPr>
-            <w:r>
-              <w:rPr>
-                <w:rFonts w:ascii="Arial" w:hAnsi="Arial" w:cs="Arial"/>
-                <w:color w:val="000000" w:themeColor="text1"/>
-                <w:sz w:val="18"/>
-                <w:szCs w:val="18"/>
-              </w:rPr>
-              <w:t xml:space="preserve">Cognitive domain </w:t>
-            </w:r>
-          </w:p>
-          <w:p>
-            <w:pPr>
-              <w:spacing w:line="216" w:lineRule="auto"/>
-              <w:jc w:val="center"/>
-              <w:rPr>
-                <w:rFonts w:ascii="Arial" w:hAnsi="Arial" w:cs="Arial"/>
-                <w:color w:val="000000" w:themeColor="text1"/>
-                <w:sz w:val="18"/>
-                <w:szCs w:val="18"/>
-              </w:rPr>
-            </w:pPr>
-            <w:r>
-              <w:rPr>
-                <w:rFonts w:ascii="Arial" w:hAnsi="Arial" w:cs="Arial"/>
-                <w:color w:val="000000" w:themeColor="text1"/>
-                <w:sz w:val="18"/>
-                <w:szCs w:val="18"/>
-              </w:rPr>
-              <w:t>– Level 4</w:t>
-            </w:r>
-          </w:p>
-        </w:tc>
-        <w:tc>
-          <w:tcPr>
-            <w:tcW w:w="1890" w:type="dxa"/>
-            <w:vAlign w:val="center"/>
-          </w:tcPr>
-          <w:p>
-            <w:pPr>
-              <w:spacing w:line="276" w:lineRule="auto"/>
-              <w:rPr>
-                <w:rFonts w:ascii="Arial" w:hAnsi="Arial" w:cs="Arial"/>
-                <w:color w:val="000000" w:themeColor="text1"/>
-                <w:sz w:val="18"/>
-                <w:szCs w:val="18"/>
-              </w:rPr>
-            </w:pPr>
-            <w:sdt>
-              <w:sdtPr>
-                <w:rPr>
-                  <w:rFonts w:ascii="Arial" w:hAnsi="Arial" w:cs="Arial"/>
-                  <w:color w:val="000000" w:themeColor="text1"/>
-                  <w:sz w:val="18"/>
-                  <w:szCs w:val="18"/>
-                </w:rPr>
-                <w:id w:val="-52466744"/>
-              </w:sdtPr>
-              <w:sdtEndPr/>
-              <w:sdtContent>
-                <w:r>
-                  <w:rPr>
-                    <w:rFonts w:ascii="MS Gothic" w:eastAsia="MS Gothic" w:hAnsi="MS Gothic" w:cs="MS Gothic" w:hint="eastAsia"/>
-                    <w:color w:val="000000" w:themeColor="text1"/>
-                    <w:sz w:val="18"/>
-                    <w:szCs w:val="18"/>
-                  </w:rPr>
-                  <w:t>☒</w:t>
-                </w:r>
-              </w:sdtContent>
-            </w:sdt>
-            <w:r>
-              <w:rPr>
-                <w:rFonts w:ascii="Arial" w:hAnsi="Arial" w:cs="Arial"/>
-                <w:color w:val="000000" w:themeColor="text1"/>
-                <w:sz w:val="18"/>
-                <w:szCs w:val="18"/>
-              </w:rPr>
-              <w:t xml:space="preserve">  Lecture Note</w:t>
-            </w:r>
-          </w:p>
-          <w:p>
-            <w:pPr>
-              <w:spacing w:line="276" w:lineRule="auto"/>
-              <w:rPr>
-                <w:rFonts w:ascii="Arial" w:hAnsi="Arial" w:cs="Arial"/>
-                <w:color w:val="000000" w:themeColor="text1"/>
-                <w:sz w:val="18"/>
-                <w:szCs w:val="18"/>
-              </w:rPr>
-            </w:pPr>
-            <w:sdt>
-              <w:sdtPr>
-                <w:rPr>
-                  <w:rFonts w:ascii="Arial" w:hAnsi="Arial" w:cs="Arial"/>
-                  <w:color w:val="000000" w:themeColor="text1"/>
-                  <w:sz w:val="18"/>
-                  <w:szCs w:val="18"/>
-                </w:rPr>
-                <w:id w:val="731125174"/>
-              </w:sdtPr>
-              <w:sdtEndPr/>
-              <w:sdtContent>
-                <w:r>
-                  <w:rPr>
-                    <w:rFonts w:ascii="MS Gothic" w:eastAsia="MS Gothic" w:hAnsi="MS Gothic" w:cs="MS Gothic" w:hint="eastAsia"/>
-                    <w:color w:val="000000" w:themeColor="text1"/>
-                    <w:sz w:val="18"/>
-                    <w:szCs w:val="18"/>
-                  </w:rPr>
-                  <w:t>☒</w:t>
-                </w:r>
-              </w:sdtContent>
-            </w:sdt>
-            <w:r>
-              <w:rPr>
-                <w:rFonts w:ascii="Arial" w:hAnsi="Arial" w:cs="Arial"/>
-                <w:color w:val="000000" w:themeColor="text1"/>
-                <w:sz w:val="18"/>
-                <w:szCs w:val="18"/>
-              </w:rPr>
-              <w:t xml:space="preserve">  Text Book</w:t>
-            </w:r>
-          </w:p>
-          <w:p>
-            <w:pPr>
-              <w:spacing w:line="276" w:lineRule="auto"/>
-              <w:rPr>
-                <w:rFonts w:ascii="Arial" w:hAnsi="Arial" w:cs="Arial"/>
-                <w:color w:val="000000" w:themeColor="text1"/>
-                <w:sz w:val="18"/>
-                <w:szCs w:val="18"/>
-              </w:rPr>
-            </w:pPr>
-            <w:sdt>
-              <w:sdtPr>
-                <w:rPr>
-                  <w:rFonts w:ascii="Arial" w:hAnsi="Arial" w:cs="Arial"/>
-                  <w:color w:val="000000" w:themeColor="text1"/>
-                  <w:sz w:val="18"/>
-                  <w:szCs w:val="18"/>
-                </w:rPr>
-                <w:id w:val="573640755"/>
-              </w:sdtPr>
-              <w:sdtEndPr/>
-              <w:sdtContent>
-                <w:r>
-                  <w:rPr>
-                    <w:rFonts w:ascii="MS Gothic" w:eastAsia="MS Gothic" w:hAnsi="MS Gothic" w:cs="MS Gothic" w:hint="eastAsia"/>
-                    <w:color w:val="000000" w:themeColor="text1"/>
-                    <w:sz w:val="18"/>
-                    <w:szCs w:val="18"/>
-                  </w:rPr>
-                  <w:t>☐</w:t>
-                </w:r>
-              </w:sdtContent>
-            </w:sdt>
-            <w:r>
-              <w:rPr>
-                <w:rFonts w:ascii="Arial" w:hAnsi="Arial" w:cs="Arial"/>
-                <w:color w:val="000000" w:themeColor="text1"/>
-                <w:sz w:val="18"/>
-                <w:szCs w:val="18"/>
-              </w:rPr>
-              <w:t xml:space="preserve">  Audio/Video</w:t>
-            </w:r>
-          </w:p>
-          <w:p>
-            <w:pPr>
-              <w:spacing w:line="276" w:lineRule="auto"/>
-              <w:rPr>
-                <w:rFonts w:ascii="Arial" w:hAnsi="Arial" w:cs="Arial"/>
-                <w:color w:val="000000" w:themeColor="text1"/>
-                <w:sz w:val="18"/>
-                <w:szCs w:val="18"/>
-              </w:rPr>
-            </w:pPr>
-            <w:sdt>
-              <w:sdtPr>
-                <w:rPr>
-                  <w:rFonts w:ascii="Arial" w:hAnsi="Arial" w:cs="Arial"/>
-                  <w:color w:val="000000" w:themeColor="text1"/>
-                  <w:sz w:val="18"/>
-                  <w:szCs w:val="18"/>
-                </w:rPr>
-                <w:id w:val="-968511615"/>
-              </w:sdtPr>
-              <w:sdtEndPr/>
               <w:sdtContent>
                 <w:sdt>
                   <w:sdtPr>
@@ -3517,9 +2859,8 @@
                       <w:sz w:val="18"/>
                       <w:szCs w:val="18"/>
                     </w:rPr>
-                    <w:id w:val="971403125"/>
+                    <w:id w:val="2127491912"/>
                   </w:sdtPr>
-                  <w:sdtEndPr/>
                   <w:sdtContent>
                     <w:r>
                       <w:rPr>
@@ -3541,12 +2882,12 @@
                 <w:sz w:val="18"/>
                 <w:szCs w:val="18"/>
               </w:rPr>
-              <w:t xml:space="preserve">  Web Material</w:t>
-            </w:r>
-          </w:p>
-          <w:p>
-            <w:pPr>
-              <w:spacing w:line="216" w:lineRule="auto"/>
+              <w:t xml:space="preserve">  Assignment </w:t>
+            </w:r>
+          </w:p>
+          <w:p>
+            <w:pPr>
+              <w:spacing w:line="276" w:lineRule="auto"/>
               <w:rPr>
                 <w:rFonts w:ascii="Arial" w:hAnsi="Arial" w:cs="Arial"/>
                 <w:color w:val="000000" w:themeColor="text1"/>
@@ -3562,9 +2903,8 @@
                   <w:sz w:val="18"/>
                   <w:szCs w:val="18"/>
                 </w:rPr>
-                <w:id w:val="654034139"/>
+                <w:id w:val="-339551353"/>
               </w:sdtPr>
-              <w:sdtEndPr/>
               <w:sdtContent>
                 <w:r>
                   <w:rPr>
@@ -3584,18 +2924,12 @@
                 <w:sz w:val="18"/>
                 <w:szCs w:val="18"/>
               </w:rPr>
-              <w:t xml:space="preserve">  Journal paper</w:t>
-            </w:r>
-          </w:p>
-        </w:tc>
-        <w:tc>
-          <w:tcPr>
-            <w:tcW w:w="1615" w:type="dxa"/>
-            <w:vAlign w:val="center"/>
-          </w:tcPr>
-          <w:p>
-            <w:pPr>
-              <w:spacing w:line="276" w:lineRule="auto"/>
+              <w:t xml:space="preserve">  Participation</w:t>
+            </w:r>
+          </w:p>
+          <w:p>
+            <w:pPr>
+              <w:spacing w:line="216" w:lineRule="auto"/>
               <w:rPr>
                 <w:rFonts w:ascii="Arial" w:hAnsi="Arial" w:cs="Arial"/>
                 <w:color w:val="000000" w:themeColor="text1"/>
@@ -3611,9 +2945,308 @@
                   <w:sz w:val="18"/>
                   <w:szCs w:val="18"/>
                 </w:rPr>
-                <w:id w:val="1630972979"/>
+                <w:id w:val="934787324"/>
               </w:sdtPr>
-              <w:sdtEndPr/>
+              <w:sdtContent>
+                <w:r>
+                  <w:rPr>
+                    <w:rFonts w:ascii="MS Gothic" w:eastAsia="MS Gothic" w:hAnsi="MS Gothic" w:cs="MS Gothic" w:hint="eastAsia"/>
+                    <w:color w:val="000000" w:themeColor="text1"/>
+                    <w:sz w:val="18"/>
+                    <w:szCs w:val="18"/>
+                  </w:rPr>
+                  <w:t>☐</w:t>
+                </w:r>
+              </w:sdtContent>
+            </w:sdt>
+            <w:r>
+              <w:rPr>
+                <w:rFonts w:ascii="Arial" w:hAnsi="Arial" w:cs="Arial"/>
+                <w:color w:val="000000" w:themeColor="text1"/>
+                <w:sz w:val="18"/>
+                <w:szCs w:val="18"/>
+              </w:rPr>
+              <w:t xml:space="preserve">  Presentation</w:t>
+            </w:r>
+          </w:p>
+        </w:tc>
+      </w:tr>
+      <w:tr>
+        <w:trPr>
+          <w:trHeight w:val="1448"/>
+          <w:jc w:val="center"/>
+        </w:trPr>
+        <w:tc>
+          <w:tcPr>
+            <w:tcW w:w="715" w:type="dxa"/>
+            <w:vAlign w:val="center"/>
+          </w:tcPr>
+          <w:p>
+            <w:pPr>
+              <w:spacing w:line="216" w:lineRule="auto"/>
+              <w:jc w:val="center"/>
+              <w:rPr>
+                <w:rFonts w:ascii="Arial" w:hAnsi="Arial" w:cs="Arial"/>
+                <w:color w:val="000000" w:themeColor="text1"/>
+                <w:sz w:val="18"/>
+                <w:szCs w:val="18"/>
+              </w:rPr>
+            </w:pPr>
+            <w:r>
+              <w:rPr>
+                <w:rFonts w:ascii="Arial" w:hAnsi="Arial" w:cs="Arial"/>
+                <w:color w:val="000000" w:themeColor="text1"/>
+                <w:sz w:val="18"/>
+                <w:szCs w:val="18"/>
+              </w:rPr>
+              <w:t>CO4</w:t>
+            </w:r>
+          </w:p>
+        </w:tc>
+        <w:tc>
+          <w:tcPr>
+            <w:tcW w:w="2160" w:type="dxa"/>
+          </w:tcPr>
+          <w:p>
+            <w:pPr>
+              <w:spacing w:line="216" w:lineRule="auto"/>
+              <w:jc w:val="center"/>
+              <w:rPr>
+                <w:rFonts w:ascii="Arial" w:hAnsi="Arial" w:cs="Arial"/>
+                <w:color w:val="000000" w:themeColor="text1"/>
+                <w:sz w:val="18"/>
+                <w:szCs w:val="18"/>
+              </w:rPr>
+            </w:pPr>
+          </w:p>
+          <w:p>
+            <w:pPr>
+              <w:spacing w:line="216" w:lineRule="auto"/>
+              <w:jc w:val="center"/>
+              <w:rPr>
+                <w:rFonts w:ascii="Arial" w:hAnsi="Arial" w:cs="Arial"/>
+                <w:color w:val="000000" w:themeColor="text1"/>
+                <w:sz w:val="18"/>
+                <w:szCs w:val="18"/>
+              </w:rPr>
+            </w:pPr>
+            <w:r>
+              <w:rPr>
+                <w:rFonts w:ascii="Arial" w:hAnsi="Arial" w:cs="Arial"/>
+                <w:color w:val="000000" w:themeColor="text1"/>
+                <w:sz w:val="18"/>
+                <w:szCs w:val="18"/>
+              </w:rPr>
+              <w:t xml:space="preserve">To </w:t>
+            </w:r>
+            <w:r>
+              <w:rPr>
+                <w:rFonts w:ascii="Arial" w:hAnsi="Arial" w:cs="Arial"/>
+                <w:b/>
+                <w:color w:val="000000" w:themeColor="text1"/>
+                <w:sz w:val="18"/>
+                <w:szCs w:val="18"/>
+              </w:rPr>
+              <w:t>compare</w:t>
+            </w:r>
+            <w:r>
+              <w:rPr>
+                <w:rFonts w:ascii="Arial" w:hAnsi="Arial" w:cs="Arial"/>
+                <w:color w:val="000000" w:themeColor="text1"/>
+                <w:sz w:val="18"/>
+                <w:szCs w:val="18"/>
+              </w:rPr>
+              <w:t xml:space="preserve"> scalability strategies, Docker-based containerization, and CI/CD pipeline approaches for production web systems</w:t>
+            </w:r>
+          </w:p>
+        </w:tc>
+        <w:tc>
+          <w:tcPr>
+            <w:tcW w:w="1530" w:type="dxa"/>
+          </w:tcPr>
+          <w:p>
+            <w:pPr>
+              <w:spacing w:line="216" w:lineRule="auto"/>
+              <w:jc w:val="center"/>
+              <w:rPr>
+                <w:rFonts w:ascii="Arial" w:hAnsi="Arial" w:cs="Arial"/>
+                <w:color w:val="000000" w:themeColor="text1"/>
+                <w:sz w:val="18"/>
+                <w:szCs w:val="18"/>
+              </w:rPr>
+            </w:pPr>
+          </w:p>
+          <w:p>
+            <w:pPr>
+              <w:spacing w:line="216" w:lineRule="auto"/>
+              <w:jc w:val="center"/>
+              <w:rPr>
+                <w:rFonts w:ascii="Arial" w:hAnsi="Arial" w:cs="Arial"/>
+                <w:color w:val="000000" w:themeColor="text1"/>
+                <w:sz w:val="18"/>
+                <w:szCs w:val="18"/>
+              </w:rPr>
+            </w:pPr>
+          </w:p>
+          <w:p>
+            <w:pPr>
+              <w:spacing w:line="216" w:lineRule="auto"/>
+              <w:jc w:val="center"/>
+              <w:rPr>
+                <w:rFonts w:ascii="Arial" w:hAnsi="Arial" w:cs="Arial"/>
+                <w:color w:val="000000" w:themeColor="text1"/>
+                <w:sz w:val="18"/>
+                <w:szCs w:val="18"/>
+              </w:rPr>
+            </w:pPr>
+            <w:r>
+              <w:rPr>
+                <w:rFonts w:ascii="Arial" w:hAnsi="Arial" w:cs="Arial"/>
+                <w:b/>
+                <w:color w:val="000000" w:themeColor="text1"/>
+                <w:sz w:val="18"/>
+                <w:szCs w:val="18"/>
+              </w:rPr>
+              <w:t>Modern Tool Usage</w:t>
+            </w:r>
+            <w:r>
+              <w:rPr>
+                <w:rFonts w:ascii="Arial" w:hAnsi="Arial" w:cs="Arial"/>
+                <w:b/>
+                <w:color w:val="000000" w:themeColor="text1"/>
+                <w:sz w:val="18"/>
+                <w:szCs w:val="18"/>
+              </w:rPr>
+              <w:t>:</w:t>
+            </w:r>
+            <w:r>
+              <w:rPr>
+                <w:rFonts w:ascii="Arial" w:hAnsi="Arial" w:cs="Arial"/>
+                <w:color w:val="000000" w:themeColor="text1"/>
+                <w:sz w:val="18"/>
+                <w:szCs w:val="18"/>
+              </w:rPr>
+              <w:t xml:space="preserve"> </w:t>
+            </w:r>
+          </w:p>
+          <w:p>
+            <w:pPr>
+              <w:spacing w:line="216" w:lineRule="auto"/>
+              <w:jc w:val="center"/>
+              <w:rPr>
+                <w:rFonts w:ascii="Arial" w:hAnsi="Arial" w:cs="Arial"/>
+                <w:color w:val="000000" w:themeColor="text1"/>
+                <w:sz w:val="18"/>
+                <w:szCs w:val="18"/>
+              </w:rPr>
+            </w:pPr>
+            <w:r>
+              <w:rPr>
+                <w:rFonts w:ascii="Arial" w:hAnsi="Arial" w:cs="Arial"/>
+                <w:color w:val="000000" w:themeColor="text1"/>
+                <w:sz w:val="18"/>
+                <w:szCs w:val="18"/>
+              </w:rPr>
+              <w:t>(PO5)</w:t>
+            </w:r>
+          </w:p>
+        </w:tc>
+        <w:tc>
+          <w:tcPr>
+            <w:tcW w:w="1440" w:type="dxa"/>
+          </w:tcPr>
+          <w:p>
+            <w:pPr>
+              <w:spacing w:line="216" w:lineRule="auto"/>
+              <w:jc w:val="center"/>
+              <w:rPr>
+                <w:rFonts w:ascii="Arial" w:hAnsi="Arial" w:cs="Arial"/>
+                <w:color w:val="000000" w:themeColor="text1"/>
+                <w:sz w:val="18"/>
+                <w:szCs w:val="18"/>
+              </w:rPr>
+            </w:pPr>
+          </w:p>
+          <w:p>
+            <w:pPr>
+              <w:spacing w:line="216" w:lineRule="auto"/>
+              <w:jc w:val="center"/>
+              <w:rPr>
+                <w:rFonts w:ascii="Arial" w:hAnsi="Arial" w:cs="Arial"/>
+                <w:color w:val="000000" w:themeColor="text1"/>
+                <w:sz w:val="18"/>
+                <w:szCs w:val="18"/>
+              </w:rPr>
+            </w:pPr>
+          </w:p>
+          <w:p>
+            <w:pPr>
+              <w:spacing w:line="216" w:lineRule="auto"/>
+              <w:jc w:val="center"/>
+              <w:rPr>
+                <w:rFonts w:ascii="Arial" w:hAnsi="Arial" w:cs="Arial"/>
+                <w:color w:val="000000" w:themeColor="text1"/>
+                <w:sz w:val="18"/>
+                <w:szCs w:val="18"/>
+              </w:rPr>
+            </w:pPr>
+            <w:r>
+              <w:rPr>
+                <w:rFonts w:ascii="Arial" w:hAnsi="Arial" w:cs="Arial"/>
+                <w:color w:val="000000" w:themeColor="text1"/>
+                <w:sz w:val="18"/>
+                <w:szCs w:val="18"/>
+              </w:rPr>
+              <w:t xml:space="preserve">Cognitive domain </w:t>
+            </w:r>
+          </w:p>
+          <w:p>
+            <w:pPr>
+              <w:spacing w:line="216" w:lineRule="auto"/>
+              <w:jc w:val="center"/>
+              <w:rPr>
+                <w:rFonts w:ascii="Arial" w:hAnsi="Arial" w:cs="Arial"/>
+                <w:color w:val="000000" w:themeColor="text1"/>
+                <w:sz w:val="18"/>
+                <w:szCs w:val="18"/>
+              </w:rPr>
+            </w:pPr>
+            <w:r>
+              <w:rPr>
+                <w:rFonts w:ascii="Arial" w:hAnsi="Arial" w:cs="Arial"/>
+                <w:color w:val="000000" w:themeColor="text1"/>
+                <w:sz w:val="18"/>
+                <w:szCs w:val="18"/>
+              </w:rPr>
+              <w:t>– Level 4</w:t>
+            </w:r>
+          </w:p>
+        </w:tc>
+        <w:tc>
+          <w:tcPr>
+            <w:tcW w:w="1890" w:type="dxa"/>
+            <w:vAlign w:val="center"/>
+          </w:tcPr>
+          <w:p>
+            <w:pPr>
+              <w:spacing w:line="276" w:lineRule="auto"/>
+              <w:rPr>
+                <w:rFonts w:ascii="Arial" w:hAnsi="Arial" w:cs="Arial"/>
+                <w:color w:val="000000" w:themeColor="text1"/>
+                <w:sz w:val="18"/>
+                <w:szCs w:val="18"/>
+              </w:rPr>
+            </w:pPr>
+            <w:sdt>
+              <w:sdtPr>
+                <w:rPr>
+                  <w:rFonts w:ascii="Arial" w:hAnsi="Arial" w:cs="Arial"/>
+                  <w:color w:val="000000" w:themeColor="text1"/>
+                  <w:sz w:val="18"/>
+                  <w:szCs w:val="18"/>
+                </w:rPr>
+                <w:id w:val="-52466744"/>
+              </w:sdtPr>
               <w:sdtContent>
                 <w:r>
                   <w:rPr>
@@ -3633,7 +3266,7 @@
                 <w:sz w:val="18"/>
                 <w:szCs w:val="18"/>
               </w:rPr>
-              <w:t xml:space="preserve">  Class Test</w:t>
+              <w:t xml:space="preserve">  Lecture Note</w:t>
             </w:r>
           </w:p>
           <w:p>
@@ -3654,9 +3287,8 @@
                   <w:sz w:val="18"/>
                   <w:szCs w:val="18"/>
                 </w:rPr>
-                <w:id w:val="-2052367580"/>
+                <w:id w:val="731125174"/>
               </w:sdtPr>
-              <w:sdtEndPr/>
               <w:sdtContent>
                 <w:r>
                   <w:rPr>
@@ -3676,7 +3308,7 @@
                 <w:sz w:val="18"/>
                 <w:szCs w:val="18"/>
               </w:rPr>
-              <w:t xml:space="preserve">  Final Exam</w:t>
+              <w:t xml:space="preserve">  Text Book</w:t>
             </w:r>
           </w:p>
           <w:p>
@@ -3697,9 +3329,50 @@
                   <w:sz w:val="18"/>
                   <w:szCs w:val="18"/>
                 </w:rPr>
-                <w:id w:val="-1147506144"/>
+                <w:id w:val="573640755"/>
               </w:sdtPr>
-              <w:sdtEndPr/>
+              <w:sdtContent>
+                <w:r>
+                  <w:rPr>
+                    <w:rFonts w:ascii="MS Gothic" w:eastAsia="MS Gothic" w:hAnsi="MS Gothic" w:cs="MS Gothic" w:hint="eastAsia"/>
+                    <w:color w:val="000000" w:themeColor="text1"/>
+                    <w:sz w:val="18"/>
+                    <w:szCs w:val="18"/>
+                  </w:rPr>
+                  <w:t>☐</w:t>
+                </w:r>
+              </w:sdtContent>
+            </w:sdt>
+            <w:r>
+              <w:rPr>
+                <w:rFonts w:ascii="Arial" w:hAnsi="Arial" w:cs="Arial"/>
+                <w:color w:val="000000" w:themeColor="text1"/>
+                <w:sz w:val="18"/>
+                <w:szCs w:val="18"/>
+              </w:rPr>
+              <w:t xml:space="preserve">  Audio/Video</w:t>
+            </w:r>
+          </w:p>
+          <w:p>
+            <w:pPr>
+              <w:spacing w:line="276" w:lineRule="auto"/>
+              <w:rPr>
+                <w:rFonts w:ascii="Arial" w:hAnsi="Arial" w:cs="Arial"/>
+                <w:color w:val="000000" w:themeColor="text1"/>
+                <w:sz w:val="18"/>
+                <w:szCs w:val="18"/>
+              </w:rPr>
+            </w:pPr>
+            <w:sdt>
+              <w:sdtPr>
+                <w:rPr>
+                  <w:rFonts w:ascii="Arial" w:hAnsi="Arial" w:cs="Arial"/>
+                  <w:color w:val="000000" w:themeColor="text1"/>
+                  <w:sz w:val="18"/>
+                  <w:szCs w:val="18"/>
+                </w:rPr>
+                <w:id w:val="-968511615"/>
+              </w:sdtPr>
               <w:sdtContent>
                 <w:sdt>
                   <w:sdtPr>
@@ -3709,9 +3382,8 @@
                       <w:sz w:val="18"/>
                       <w:szCs w:val="18"/>
                     </w:rPr>
-                    <w:id w:val="1468777303"/>
+                    <w:id w:val="971403125"/>
                   </w:sdtPr>
-                  <w:sdtEndPr/>
                   <w:sdtContent>
                     <w:r>
                       <w:rPr>
@@ -3733,12 +3405,12 @@
                 <w:sz w:val="18"/>
                 <w:szCs w:val="18"/>
               </w:rPr>
-              <w:t xml:space="preserve">  Assignment </w:t>
-            </w:r>
-          </w:p>
-          <w:p>
-            <w:pPr>
-              <w:spacing w:line="276" w:lineRule="auto"/>
+              <w:t xml:space="preserve">  Web Material</w:t>
+            </w:r>
+          </w:p>
+          <w:p>
+            <w:pPr>
+              <w:spacing w:line="216" w:lineRule="auto"/>
               <w:rPr>
                 <w:rFonts w:ascii="Arial" w:hAnsi="Arial" w:cs="Arial"/>
                 <w:color w:val="000000" w:themeColor="text1"/>
@@ -3754,9 +3426,8 @@
                   <w:sz w:val="18"/>
                   <w:szCs w:val="18"/>
                 </w:rPr>
-                <w:id w:val="-1703396396"/>
+                <w:id w:val="654034139"/>
               </w:sdtPr>
-              <w:sdtEndPr/>
               <w:sdtContent>
                 <w:r>
                   <w:rPr>
@@ -3776,6 +3447,206 @@
                 <w:sz w:val="18"/>
                 <w:szCs w:val="18"/>
               </w:rPr>
+              <w:t xml:space="preserve">  Journal paper</w:t>
+            </w:r>
+          </w:p>
+        </w:tc>
+        <w:tc>
+          <w:tcPr>
+            <w:tcW w:w="1615" w:type="dxa"/>
+            <w:vAlign w:val="center"/>
+          </w:tcPr>
+          <w:p>
+            <w:pPr>
+              <w:spacing w:line="276" w:lineRule="auto"/>
+              <w:rPr>
+                <w:rFonts w:ascii="Arial" w:hAnsi="Arial" w:cs="Arial"/>
+                <w:color w:val="000000" w:themeColor="text1"/>
+                <w:sz w:val="18"/>
+                <w:szCs w:val="18"/>
+              </w:rPr>
+            </w:pPr>
+            <w:sdt>
+              <w:sdtPr>
+                <w:rPr>
+                  <w:rFonts w:ascii="Arial" w:hAnsi="Arial" w:cs="Arial"/>
+                  <w:color w:val="000000" w:themeColor="text1"/>
+                  <w:sz w:val="18"/>
+                  <w:szCs w:val="18"/>
+                </w:rPr>
+                <w:id w:val="1630972979"/>
+              </w:sdtPr>
+              <w:sdtContent>
+                <w:r>
+                  <w:rPr>
+                    <w:rFonts w:ascii="MS Gothic" w:eastAsia="MS Gothic" w:hAnsi="MS Gothic" w:cs="MS Gothic" w:hint="eastAsia"/>
+                    <w:color w:val="000000" w:themeColor="text1"/>
+                    <w:sz w:val="18"/>
+                    <w:szCs w:val="18"/>
+                  </w:rPr>
+                  <w:t>☒</w:t>
+                </w:r>
+              </w:sdtContent>
+            </w:sdt>
+            <w:r>
+              <w:rPr>
+                <w:rFonts w:ascii="Arial" w:hAnsi="Arial" w:cs="Arial"/>
+                <w:color w:val="000000" w:themeColor="text1"/>
+                <w:sz w:val="18"/>
+                <w:szCs w:val="18"/>
+              </w:rPr>
+              <w:t xml:space="preserve">  CA</w:t>
+            </w:r>
+          </w:p>
+          <w:p>
+            <w:pPr>
+              <w:spacing w:line="276" w:lineRule="auto"/>
+              <w:rPr>
+                <w:rFonts w:ascii="Arial" w:hAnsi="Arial" w:cs="Arial"/>
+                <w:color w:val="000000" w:themeColor="text1"/>
+                <w:sz w:val="18"/>
+                <w:szCs w:val="18"/>
+              </w:rPr>
+            </w:pPr>
+            <w:sdt>
+              <w:sdtPr>
+                <w:rPr>
+                  <w:rFonts w:ascii="Arial" w:hAnsi="Arial" w:cs="Arial"/>
+                  <w:color w:val="000000" w:themeColor="text1"/>
+                  <w:sz w:val="18"/>
+                  <w:szCs w:val="18"/>
+                </w:rPr>
+                <w:id w:val="-2052367580"/>
+              </w:sdtPr>
+              <w:sdtContent>
+                <w:sdt>
+                  <w:sdtPr>
+                    <w:rPr>
+                      <w:rFonts w:ascii="Arial" w:hAnsi="Arial" w:cs="Arial"/>
+                      <w:color w:val="000000" w:themeColor="text1"/>
+                      <w:sz w:val="18"/>
+                      <w:szCs w:val="18"/>
+                    </w:rPr>
+                    <w:id w:val="-2008590624"/>
+                  </w:sdtPr>
+                  <w:sdtContent>
+                    <w:r>
+                      <w:rPr>
+                        <w:rFonts w:ascii="MS Gothic" w:eastAsia="MS Gothic" w:hAnsi="MS Gothic" w:cs="MS Gothic" w:hint="eastAsia"/>
+                        <w:color w:val="000000" w:themeColor="text1"/>
+                        <w:sz w:val="18"/>
+                        <w:szCs w:val="18"/>
+                      </w:rPr>
+                      <w:t>☐</w:t>
+                    </w:r>
+                  </w:sdtContent>
+                </w:sdt>
+              </w:sdtContent>
+            </w:sdt>
+            <w:r>
+              <w:rPr>
+                <w:rFonts w:ascii="Arial" w:hAnsi="Arial" w:cs="Arial"/>
+                <w:color w:val="000000" w:themeColor="text1"/>
+                <w:sz w:val="18"/>
+                <w:szCs w:val="18"/>
+              </w:rPr>
+              <w:t xml:space="preserve">  Final Exam</w:t>
+            </w:r>
+          </w:p>
+          <w:p>
+            <w:pPr>
+              <w:spacing w:line="276" w:lineRule="auto"/>
+              <w:rPr>
+                <w:rFonts w:ascii="Arial" w:hAnsi="Arial" w:cs="Arial"/>
+                <w:color w:val="000000" w:themeColor="text1"/>
+                <w:sz w:val="18"/>
+                <w:szCs w:val="18"/>
+              </w:rPr>
+            </w:pPr>
+            <w:sdt>
+              <w:sdtPr>
+                <w:rPr>
+                  <w:rFonts w:ascii="Arial" w:hAnsi="Arial" w:cs="Arial"/>
+                  <w:color w:val="000000" w:themeColor="text1"/>
+                  <w:sz w:val="18"/>
+                  <w:szCs w:val="18"/>
+                </w:rPr>
+                <w:id w:val="-1147506144"/>
+              </w:sdtPr>
+              <w:sdtContent>
+                <w:sdt>
+                  <w:sdtPr>
+                    <w:rPr>
+                      <w:rFonts w:ascii="Arial" w:hAnsi="Arial" w:cs="Arial"/>
+                      <w:color w:val="000000" w:themeColor="text1"/>
+                      <w:sz w:val="18"/>
+                      <w:szCs w:val="18"/>
+                    </w:rPr>
+                    <w:id w:val="1468777303"/>
+                  </w:sdtPr>
+                  <w:sdtContent>
+                    <w:r>
+                      <w:rPr>
+                        <w:rFonts w:ascii="MS Gothic" w:eastAsia="MS Gothic" w:hAnsi="MS Gothic" w:cs="MS Gothic" w:hint="eastAsia"/>
+                        <w:color w:val="000000" w:themeColor="text1"/>
+                        <w:sz w:val="18"/>
+                        <w:szCs w:val="18"/>
+                      </w:rPr>
+                      <w:t>☒</w:t>
+                    </w:r>
+                  </w:sdtContent>
+                </w:sdt>
+              </w:sdtContent>
+            </w:sdt>
+            <w:r>
+              <w:rPr>
+                <w:rFonts w:ascii="Arial" w:hAnsi="Arial" w:cs="Arial"/>
+                <w:color w:val="000000" w:themeColor="text1"/>
+                <w:sz w:val="18"/>
+                <w:szCs w:val="18"/>
+              </w:rPr>
+              <w:t xml:space="preserve">  Assignment </w:t>
+            </w:r>
+          </w:p>
+          <w:p>
+            <w:pPr>
+              <w:spacing w:line="276" w:lineRule="auto"/>
+              <w:rPr>
+                <w:rFonts w:ascii="Arial" w:hAnsi="Arial" w:cs="Arial"/>
+                <w:color w:val="000000" w:themeColor="text1"/>
+                <w:sz w:val="18"/>
+                <w:szCs w:val="18"/>
+              </w:rPr>
+            </w:pPr>
+            <w:sdt>
+              <w:sdtPr>
+                <w:rPr>
+                  <w:rFonts w:ascii="Arial" w:hAnsi="Arial" w:cs="Arial"/>
+                  <w:color w:val="000000" w:themeColor="text1"/>
+                  <w:sz w:val="18"/>
+                  <w:szCs w:val="18"/>
+                </w:rPr>
+                <w:id w:val="-1703396396"/>
+              </w:sdtPr>
+              <w:sdtContent>
+                <w:r>
+                  <w:rPr>
+                    <w:rFonts w:ascii="MS Gothic" w:eastAsia="MS Gothic" w:hAnsi="MS Gothic" w:cs="MS Gothic" w:hint="eastAsia"/>
+                    <w:color w:val="000000" w:themeColor="text1"/>
+                    <w:sz w:val="18"/>
+                    <w:szCs w:val="18"/>
+                  </w:rPr>
+                  <w:t>☐</w:t>
+                </w:r>
+              </w:sdtContent>
+            </w:sdt>
+            <w:r>
+              <w:rPr>
+                <w:rFonts w:ascii="Arial" w:hAnsi="Arial" w:cs="Arial"/>
+                <w:color w:val="000000" w:themeColor="text1"/>
+                <w:sz w:val="18"/>
+                <w:szCs w:val="18"/>
+              </w:rPr>
               <w:t xml:space="preserve">  Participation</w:t>
             </w:r>
           </w:p>
@@ -3799,17 +3670,29 @@
                 </w:rPr>
                 <w:id w:val="-1948304080"/>
               </w:sdtPr>
-              <w:sdtEndPr/>
               <w:sdtContent>
-                <w:r>
-                  <w:rPr>
-                    <w:rFonts w:ascii="MS Gothic" w:eastAsia="MS Gothic" w:hAnsi="MS Gothic" w:cs="MS Gothic" w:hint="eastAsia"/>
-                    <w:color w:val="000000" w:themeColor="text1"/>
-                    <w:sz w:val="18"/>
-                    <w:szCs w:val="18"/>
-                  </w:rPr>
-                  <w:t>☐</w:t>
-                </w:r>
+                <w:sdt>
+                  <w:sdtPr>
+                    <w:rPr>
+                      <w:rFonts w:ascii="Arial" w:hAnsi="Arial" w:cs="Arial"/>
+                      <w:color w:val="000000" w:themeColor="text1"/>
+                      <w:sz w:val="18"/>
+                      <w:szCs w:val="18"/>
+                    </w:rPr>
+                    <w:id w:val="-667783488"/>
+                  </w:sdtPr>
+                  <w:sdtContent>
+                    <w:r>
+                      <w:rPr>
+                        <w:rFonts w:ascii="MS Gothic" w:eastAsia="MS Gothic" w:hAnsi="MS Gothic" w:cs="MS Gothic" w:hint="eastAsia"/>
+                        <w:color w:val="000000" w:themeColor="text1"/>
+                        <w:sz w:val="18"/>
+                        <w:szCs w:val="18"/>
+                      </w:rPr>
+                      <w:t>☒</w:t>
+                    </w:r>
+                  </w:sdtContent>
+                </w:sdt>
               </w:sdtContent>
             </w:sdt>
             <w:r>
@@ -4134,31 +4017,7 @@
                 <w:szCs w:val="18"/>
                 <w:shd w:val="clear" w:color="auto" w:fill="FFFFFF"/>
               </w:rPr>
-              <w:t xml:space="preserve">Stakeholder communication. Requirement elicitation techniques. Scope definition and feasibility analysis. Project planning: scheduling, effort estimation, milestones, </w:t>
-            </w:r>
-            <w:proofErr w:type="gramStart"/>
-            <w:r>
-              <w:rPr>
-                <w:rFonts w:ascii="Arial" w:hAnsi="Arial" w:cs="Arial"/>
-                <w:bCs/>
-                <w:color w:val="000000"/>
-                <w:sz w:val="18"/>
-                <w:szCs w:val="18"/>
-                <w:shd w:val="clear" w:color="auto" w:fill="FFFFFF"/>
-              </w:rPr>
-              <w:t>deliverables</w:t>
-            </w:r>
-            <w:proofErr w:type="gramEnd"/>
-            <w:r>
-              <w:rPr>
-                <w:rFonts w:ascii="Arial" w:hAnsi="Arial" w:cs="Arial"/>
-                <w:bCs/>
-                <w:color w:val="000000"/>
-                <w:sz w:val="18"/>
-                <w:szCs w:val="18"/>
-                <w:shd w:val="clear" w:color="auto" w:fill="FFFFFF"/>
-              </w:rPr>
-              <w:t>. Team roles, project tracking, and project metrics. Analysis modelling. Content modelling. Interaction modelling. Architectural modelling. Validation of models before implementation.</w:t>
+              <w:t>Stakeholder communication. Requirement elicitation techniques. Scope definition and feasibility analysis. Project planning: scheduling, effort estimation, milestones, deliverables. Team roles, project tracking, and project metrics. Analysis modelling. Content modelling. Interaction modelling. Architectural modelling. Validation of models before implementation.</w:t>
             </w:r>
           </w:p>
           <w:p>
@@ -4280,7 +4139,7 @@
                 <w:szCs w:val="18"/>
                 <w:shd w:val="clear" w:color="auto" w:fill="FFFFFF"/>
               </w:rPr>
-              <w:t xml:space="preserve">HTTP as an application protocol: methods, status codes, headers. REST architectural constraints. </w:t>
+              <w:t xml:space="preserve">HTTP as an application protocol: methods, status codes, headers. REST architectural constraints. RESTful API design: resource naming, URI structure, versioning. API data formats: JSON and XML. API documentation standards: </w:t>
             </w:r>
             <w:proofErr w:type="spellStart"/>
             <w:r>
@@ -4292,7 +4151,7 @@
                 <w:szCs w:val="18"/>
                 <w:shd w:val="clear" w:color="auto" w:fill="FFFFFF"/>
               </w:rPr>
-              <w:t>RESTful</w:t>
+              <w:t>OpenAPI</w:t>
             </w:r>
             <w:proofErr w:type="spellEnd"/>
             <w:r>
@@ -4304,7 +4163,7 @@
                 <w:szCs w:val="18"/>
                 <w:shd w:val="clear" w:color="auto" w:fill="FFFFFF"/>
               </w:rPr>
-              <w:t xml:space="preserve"> API design: resource naming, URI structure, versioning. API data formats: JSON and XML. API documentation standards: </w:t>
+              <w:t xml:space="preserve"> / Swagger. Web services: SOAP vs. REST, </w:t>
             </w:r>
             <w:proofErr w:type="spellStart"/>
             <w:r>
@@ -4316,7 +4175,7 @@
                 <w:szCs w:val="18"/>
                 <w:shd w:val="clear" w:color="auto" w:fill="FFFFFF"/>
               </w:rPr>
-              <w:t>OpenAPI</w:t>
+              <w:t>GraphQL</w:t>
             </w:r>
             <w:proofErr w:type="spellEnd"/>
             <w:r>
@@ -4328,7 +4187,7 @@
                 <w:szCs w:val="18"/>
                 <w:shd w:val="clear" w:color="auto" w:fill="FFFFFF"/>
               </w:rPr>
-              <w:t xml:space="preserve"> / Swagger. Web services: SOAP vs. REST, </w:t>
+              <w:t xml:space="preserve">. API security fundamentals: API keys, OAuth 2.0, JWT. Single Page Applications (SPAs). SSR vs. CSR vs. SSG. Introduction to microservices. Server-side framework patterns in Express.js, </w:t>
             </w:r>
             <w:proofErr w:type="spellStart"/>
             <w:r>
@@ -4340,7 +4199,7 @@
                 <w:szCs w:val="18"/>
                 <w:shd w:val="clear" w:color="auto" w:fill="FFFFFF"/>
               </w:rPr>
-              <w:t>GraphQL</w:t>
+              <w:t>AdonisJS</w:t>
             </w:r>
             <w:proofErr w:type="spellEnd"/>
             <w:r>
@@ -4352,151 +4211,7 @@
                 <w:szCs w:val="18"/>
                 <w:shd w:val="clear" w:color="auto" w:fill="FFFFFF"/>
               </w:rPr>
-              <w:t xml:space="preserve">. API security fundamentals: API keys, </w:t>
-            </w:r>
-            <w:proofErr w:type="spellStart"/>
-            <w:r>
-              <w:rPr>
-                <w:rFonts w:ascii="Arial" w:hAnsi="Arial" w:cs="Arial"/>
-                <w:bCs/>
-                <w:color w:val="000000"/>
-                <w:sz w:val="18"/>
-                <w:szCs w:val="18"/>
-                <w:shd w:val="clear" w:color="auto" w:fill="FFFFFF"/>
-              </w:rPr>
-              <w:t>OAuth</w:t>
-            </w:r>
-            <w:proofErr w:type="spellEnd"/>
-            <w:r>
-              <w:rPr>
-                <w:rFonts w:ascii="Arial" w:hAnsi="Arial" w:cs="Arial"/>
-                <w:bCs/>
-                <w:color w:val="000000"/>
-                <w:sz w:val="18"/>
-                <w:szCs w:val="18"/>
-                <w:shd w:val="clear" w:color="auto" w:fill="FFFFFF"/>
-              </w:rPr>
-              <w:t xml:space="preserve"> 2.0, JWT. Single Page Applications (SPAs). SSR vs. CSR vs. SSG. Introduction to </w:t>
-            </w:r>
-            <w:proofErr w:type="spellStart"/>
-            <w:r>
-              <w:rPr>
-                <w:rFonts w:ascii="Arial" w:hAnsi="Arial" w:cs="Arial"/>
-                <w:bCs/>
-                <w:color w:val="000000"/>
-                <w:sz w:val="18"/>
-                <w:szCs w:val="18"/>
-                <w:shd w:val="clear" w:color="auto" w:fill="FFFFFF"/>
-              </w:rPr>
-              <w:t>microservices</w:t>
-            </w:r>
-            <w:proofErr w:type="spellEnd"/>
-            <w:r>
-              <w:rPr>
-                <w:rFonts w:ascii="Arial" w:hAnsi="Arial" w:cs="Arial"/>
-                <w:bCs/>
-                <w:color w:val="000000"/>
-                <w:sz w:val="18"/>
-                <w:szCs w:val="18"/>
-                <w:shd w:val="clear" w:color="auto" w:fill="FFFFFF"/>
-              </w:rPr>
-              <w:t xml:space="preserve">. Server-side framework patterns in Express.js, </w:t>
-            </w:r>
-            <w:proofErr w:type="spellStart"/>
-            <w:r>
-              <w:rPr>
-                <w:rFonts w:ascii="Arial" w:hAnsi="Arial" w:cs="Arial"/>
-                <w:bCs/>
-                <w:color w:val="000000"/>
-                <w:sz w:val="18"/>
-                <w:szCs w:val="18"/>
-                <w:shd w:val="clear" w:color="auto" w:fill="FFFFFF"/>
-              </w:rPr>
-              <w:t>AdonisJS</w:t>
-            </w:r>
-            <w:proofErr w:type="spellEnd"/>
-            <w:r>
-              <w:rPr>
-                <w:rFonts w:ascii="Arial" w:hAnsi="Arial" w:cs="Arial"/>
-                <w:bCs/>
-                <w:color w:val="000000"/>
-                <w:sz w:val="18"/>
-                <w:szCs w:val="18"/>
-                <w:shd w:val="clear" w:color="auto" w:fill="FFFFFF"/>
-              </w:rPr>
-              <w:t xml:space="preserve">, and </w:t>
-            </w:r>
-            <w:proofErr w:type="spellStart"/>
-            <w:r>
-              <w:rPr>
-                <w:rFonts w:ascii="Arial" w:hAnsi="Arial" w:cs="Arial"/>
-                <w:bCs/>
-                <w:color w:val="000000"/>
-                <w:sz w:val="18"/>
-                <w:szCs w:val="18"/>
-                <w:shd w:val="clear" w:color="auto" w:fill="FFFFFF"/>
-              </w:rPr>
-              <w:t>Laravel</w:t>
-            </w:r>
-            <w:proofErr w:type="spellEnd"/>
-            <w:r>
-              <w:rPr>
-                <w:rFonts w:ascii="Arial" w:hAnsi="Arial" w:cs="Arial"/>
-                <w:bCs/>
-                <w:color w:val="000000"/>
-                <w:sz w:val="18"/>
-                <w:szCs w:val="18"/>
-                <w:shd w:val="clear" w:color="auto" w:fill="FFFFFF"/>
-              </w:rPr>
-              <w:t>. Backend-as-a-Service (</w:t>
-            </w:r>
-            <w:proofErr w:type="spellStart"/>
-            <w:r>
-              <w:rPr>
-                <w:rFonts w:ascii="Arial" w:hAnsi="Arial" w:cs="Arial"/>
-                <w:bCs/>
-                <w:color w:val="000000"/>
-                <w:sz w:val="18"/>
-                <w:szCs w:val="18"/>
-                <w:shd w:val="clear" w:color="auto" w:fill="FFFFFF"/>
-              </w:rPr>
-              <w:t>BaaS</w:t>
-            </w:r>
-            <w:proofErr w:type="spellEnd"/>
-            <w:r>
-              <w:rPr>
-                <w:rFonts w:ascii="Arial" w:hAnsi="Arial" w:cs="Arial"/>
-                <w:bCs/>
-                <w:color w:val="000000"/>
-                <w:sz w:val="18"/>
-                <w:szCs w:val="18"/>
-                <w:shd w:val="clear" w:color="auto" w:fill="FFFFFF"/>
-              </w:rPr>
-              <w:t xml:space="preserve">) and </w:t>
-            </w:r>
-            <w:proofErr w:type="spellStart"/>
-            <w:r>
-              <w:rPr>
-                <w:rFonts w:ascii="Arial" w:hAnsi="Arial" w:cs="Arial"/>
-                <w:bCs/>
-                <w:color w:val="000000"/>
-                <w:sz w:val="18"/>
-                <w:szCs w:val="18"/>
-                <w:shd w:val="clear" w:color="auto" w:fill="FFFFFF"/>
-              </w:rPr>
-              <w:t>serverless</w:t>
-            </w:r>
-            <w:proofErr w:type="spellEnd"/>
-            <w:r>
-              <w:rPr>
-                <w:rFonts w:ascii="Arial" w:hAnsi="Arial" w:cs="Arial"/>
-                <w:bCs/>
-                <w:color w:val="000000"/>
-                <w:sz w:val="18"/>
-                <w:szCs w:val="18"/>
-                <w:shd w:val="clear" w:color="auto" w:fill="FFFFFF"/>
-              </w:rPr>
-              <w:t xml:space="preserve"> concepts.</w:t>
+              <w:t>, and Laravel. Backend-as-a-Service (BaaS) and serverless concepts.</w:t>
             </w:r>
           </w:p>
           <w:p>
@@ -4579,31 +4294,7 @@
                 <w:szCs w:val="18"/>
                 <w:shd w:val="clear" w:color="auto" w:fill="FFFFFF"/>
               </w:rPr>
-              <w:t>OWASP Top 10 overview. Injection attacks. Cross-Site Scripting (XSS). Cross-Site Request Forgery (CSRF). Compromising authentication. Session and cookie security. Information leaks. Denial of Service (</w:t>
-            </w:r>
-            <w:proofErr w:type="spellStart"/>
-            <w:r>
-              <w:rPr>
-                <w:rFonts w:ascii="Arial" w:hAnsi="Arial" w:cs="Arial"/>
-                <w:bCs/>
-                <w:color w:val="000000"/>
-                <w:sz w:val="18"/>
-                <w:szCs w:val="18"/>
-                <w:shd w:val="clear" w:color="auto" w:fill="FFFFFF"/>
-              </w:rPr>
-              <w:t>DoS</w:t>
-            </w:r>
-            <w:proofErr w:type="spellEnd"/>
-            <w:r>
-              <w:rPr>
-                <w:rFonts w:ascii="Arial" w:hAnsi="Arial" w:cs="Arial"/>
-                <w:bCs/>
-                <w:color w:val="000000"/>
-                <w:sz w:val="18"/>
-                <w:szCs w:val="18"/>
-                <w:shd w:val="clear" w:color="auto" w:fill="FFFFFF"/>
-              </w:rPr>
-              <w:t xml:space="preserve">) attacks. Secure input handling, validation, </w:t>
+              <w:t xml:space="preserve">OWASP Top 10 overview. Injection attacks. Cross-Site Scripting (XSS). Cross-Site Request Forgery (CSRF). Compromising authentication. Session and cookie security. Information leaks. Denial of Service (DoS) attacks. Secure input handling, validation, </w:t>
             </w:r>
             <w:proofErr w:type="spellStart"/>
             <w:r>
@@ -4676,31 +4367,7 @@
                 <w:szCs w:val="18"/>
                 <w:shd w:val="clear" w:color="auto" w:fill="FFFFFF"/>
               </w:rPr>
-              <w:t xml:space="preserve">Testing web apps vs. traditional software. Content testing. User interface testing. Navigation testing. Configuration testing. Security testing. Performance testing. Test automation strategies: Selenium, Playwright, </w:t>
-            </w:r>
-            <w:proofErr w:type="gramStart"/>
-            <w:r>
-              <w:rPr>
-                <w:rFonts w:ascii="Arial" w:hAnsi="Arial" w:cs="Arial"/>
-                <w:bCs/>
-                <w:color w:val="000000"/>
-                <w:sz w:val="18"/>
-                <w:szCs w:val="18"/>
-                <w:shd w:val="clear" w:color="auto" w:fill="FFFFFF"/>
-              </w:rPr>
-              <w:t>Cypress</w:t>
-            </w:r>
-            <w:proofErr w:type="gramEnd"/>
-            <w:r>
-              <w:rPr>
-                <w:rFonts w:ascii="Arial" w:hAnsi="Arial" w:cs="Arial"/>
-                <w:bCs/>
-                <w:color w:val="000000"/>
-                <w:sz w:val="18"/>
-                <w:szCs w:val="18"/>
-                <w:shd w:val="clear" w:color="auto" w:fill="FFFFFF"/>
-              </w:rPr>
-              <w:t>.</w:t>
+              <w:t>Testing web apps vs. traditional software. Content testing. User interface testing. Navigation testing. Configuration testing. Security testing. Performance testing. Test automation strategies: Selenium, Playwright, Cypress.</w:t>
             </w:r>
           </w:p>
           <w:p>
@@ -4749,7 +4416,7 @@
                 <w:szCs w:val="18"/>
                 <w:shd w:val="clear" w:color="auto" w:fill="FFFFFF"/>
               </w:rPr>
-              <w:t xml:space="preserve">Scalability concepts. Root causes of scalability issues. Vertical scaling. Horizontal scaling. CDN (Content Delivery Networks). Caching strategies. Database scaling: read replicas and </w:t>
+              <w:t xml:space="preserve">Scalability concepts. Root causes of scalability issues. Vertical scaling. Horizontal scaling. CDN (Content Delivery Networks). Caching strategies. Database scaling: read replicas and sharding. Asynchronous processing: message queues and pub/sub patterns. Load balancer role in system architecture. Load balancing algorithms: Round Robin, Weighted Round Robin, Least Connections, and IP Hash. Session persistence (sticky sessions). SSL/TLS termination. </w:t>
             </w:r>
             <w:proofErr w:type="spellStart"/>
             <w:r>
@@ -4761,7 +4428,7 @@
                 <w:szCs w:val="18"/>
                 <w:shd w:val="clear" w:color="auto" w:fill="FFFFFF"/>
               </w:rPr>
-              <w:t>sharding</w:t>
+              <w:t>GeoDNS</w:t>
             </w:r>
             <w:proofErr w:type="spellEnd"/>
             <w:r>
@@ -4773,55 +4440,7 @@
                 <w:szCs w:val="18"/>
                 <w:shd w:val="clear" w:color="auto" w:fill="FFFFFF"/>
               </w:rPr>
-              <w:t xml:space="preserve">. Asynchronous processing: message queues and pub/sub patterns. Load balancer role in system architecture. Load balancing algorithms: Round Robin, Weighted Round Robin, Least Connections, and IP Hash. Session persistence (sticky sessions). SSL/TLS termination. </w:t>
-            </w:r>
-            <w:proofErr w:type="spellStart"/>
-            <w:r>
-              <w:rPr>
-                <w:rFonts w:ascii="Arial" w:hAnsi="Arial" w:cs="Arial"/>
-                <w:bCs/>
-                <w:color w:val="000000"/>
-                <w:sz w:val="18"/>
-                <w:szCs w:val="18"/>
-                <w:shd w:val="clear" w:color="auto" w:fill="FFFFFF"/>
-              </w:rPr>
-              <w:t>GeoDNS</w:t>
-            </w:r>
-            <w:proofErr w:type="spellEnd"/>
-            <w:r>
-              <w:rPr>
-                <w:rFonts w:ascii="Arial" w:hAnsi="Arial" w:cs="Arial"/>
-                <w:bCs/>
-                <w:color w:val="000000"/>
-                <w:sz w:val="18"/>
-                <w:szCs w:val="18"/>
-                <w:shd w:val="clear" w:color="auto" w:fill="FFFFFF"/>
-              </w:rPr>
-              <w:t xml:space="preserve">. Layer 4 vs. Layer 7 load balancing. Real-world examples: </w:t>
-            </w:r>
-            <w:proofErr w:type="spellStart"/>
-            <w:r>
-              <w:rPr>
-                <w:rFonts w:ascii="Arial" w:hAnsi="Arial" w:cs="Arial"/>
-                <w:bCs/>
-                <w:color w:val="000000"/>
-                <w:sz w:val="18"/>
-                <w:szCs w:val="18"/>
-                <w:shd w:val="clear" w:color="auto" w:fill="FFFFFF"/>
-              </w:rPr>
-              <w:t>Nginx</w:t>
-            </w:r>
-            <w:proofErr w:type="spellEnd"/>
-            <w:r>
-              <w:rPr>
-                <w:rFonts w:ascii="Arial" w:hAnsi="Arial" w:cs="Arial"/>
-                <w:bCs/>
-                <w:color w:val="000000"/>
-                <w:sz w:val="18"/>
-                <w:szCs w:val="18"/>
-                <w:shd w:val="clear" w:color="auto" w:fill="FFFFFF"/>
-              </w:rPr>
-              <w:t xml:space="preserve">, </w:t>
+              <w:t xml:space="preserve">. Layer 4 vs. Layer 7 load balancing. Real-world examples: Nginx, </w:t>
             </w:r>
             <w:proofErr w:type="spellStart"/>
             <w:r>
@@ -4885,46 +4504,68 @@
                 <w:szCs w:val="18"/>
                 <w:shd w:val="clear" w:color="auto" w:fill="FFFFFF"/>
               </w:rPr>
-              <w:t xml:space="preserve">, CI/CD, and </w:t>
+              <w:t>, CI/CD, and DevOps Practices</w:t>
+            </w:r>
+            <w:r>
+              <w:rPr>
+                <w:rFonts w:ascii="Arial" w:hAnsi="Arial" w:cs="Arial"/>
+                <w:b/>
+                <w:bCs/>
+                <w:color w:val="000000"/>
+                <w:sz w:val="18"/>
+                <w:szCs w:val="18"/>
+                <w:shd w:val="clear" w:color="auto" w:fill="FFFFFF"/>
+              </w:rPr>
+              <w:t xml:space="preserve">: </w:t>
+            </w:r>
+            <w:r>
+              <w:rPr>
+                <w:rFonts w:ascii="Arial" w:hAnsi="Arial" w:cs="Arial"/>
+                <w:bCs/>
+                <w:color w:val="000000"/>
+                <w:sz w:val="18"/>
+                <w:szCs w:val="18"/>
+                <w:shd w:val="clear" w:color="auto" w:fill="FFFFFF"/>
+              </w:rPr>
+              <w:t xml:space="preserve">Virtual machines vs. containers. Docker architecture: Docker Engine, images, containers, Docker Hub registry, </w:t>
             </w:r>
             <w:proofErr w:type="spellStart"/>
             <w:r>
               <w:rPr>
                 <w:rFonts w:ascii="Arial" w:hAnsi="Arial" w:cs="Arial"/>
-                <w:b/>
                 <w:bCs/>
                 <w:color w:val="000000"/>
                 <w:sz w:val="18"/>
                 <w:szCs w:val="18"/>
                 <w:shd w:val="clear" w:color="auto" w:fill="FFFFFF"/>
               </w:rPr>
-              <w:t>DevOps</w:t>
+              <w:t>Dockerfile</w:t>
             </w:r>
             <w:proofErr w:type="spellEnd"/>
             <w:r>
               <w:rPr>
                 <w:rFonts w:ascii="Arial" w:hAnsi="Arial" w:cs="Arial"/>
-                <w:b/>
                 <w:bCs/>
                 <w:color w:val="000000"/>
                 <w:sz w:val="18"/>
                 <w:szCs w:val="18"/>
                 <w:shd w:val="clear" w:color="auto" w:fill="FFFFFF"/>
               </w:rPr>
-              <w:t xml:space="preserve"> Practices</w:t>
-            </w:r>
-            <w:r>
-              <w:rPr>
-                <w:rFonts w:ascii="Arial" w:hAnsi="Arial" w:cs="Arial"/>
-                <w:b/>
+              <w:t xml:space="preserve">. </w:t>
+            </w:r>
+            <w:proofErr w:type="spellStart"/>
+            <w:r>
+              <w:rPr>
+                <w:rFonts w:ascii="Arial" w:hAnsi="Arial" w:cs="Arial"/>
                 <w:bCs/>
                 <w:color w:val="000000"/>
                 <w:sz w:val="18"/>
                 <w:szCs w:val="18"/>
                 <w:shd w:val="clear" w:color="auto" w:fill="FFFFFF"/>
               </w:rPr>
-              <w:t xml:space="preserve">: </w:t>
-            </w:r>
+              <w:t>Dockerfile</w:t>
+            </w:r>
+            <w:proofErr w:type="spellEnd"/>
             <w:r>
               <w:rPr>
                 <w:rFonts w:ascii="Arial" w:hAnsi="Arial" w:cs="Arial"/>
@@ -4934,7 +4575,7 @@
                 <w:szCs w:val="18"/>
                 <w:shd w:val="clear" w:color="auto" w:fill="FFFFFF"/>
               </w:rPr>
-              <w:t xml:space="preserve">Virtual machines vs. containers. </w:t>
+              <w:t xml:space="preserve"> basics: FROM, COPY, RUN, EXPOSE, CMD. Building and running images: docker build, docker run, port mapping, environment variables. Docker Compose. Container networking. Container orchestration concepts. Docker in the development workflow. CI/CD concepts: Continuous Integration, Continuous Delivery, Continuous Deployment. CI pipeline stages. CD pipeline stages. GitHub Actions. </w:t>
             </w:r>
             <w:proofErr w:type="spellStart"/>
             <w:r>
@@ -4946,7 +4587,7 @@
                 <w:szCs w:val="18"/>
                 <w:shd w:val="clear" w:color="auto" w:fill="FFFFFF"/>
               </w:rPr>
-              <w:t>Docker</w:t>
+              <w:t>Containerised</w:t>
             </w:r>
             <w:proofErr w:type="spellEnd"/>
             <w:r>
@@ -4958,271 +4599,7 @@
                 <w:szCs w:val="18"/>
                 <w:shd w:val="clear" w:color="auto" w:fill="FFFFFF"/>
               </w:rPr>
-              <w:t xml:space="preserve"> architecture: </w:t>
-            </w:r>
-            <w:proofErr w:type="spellStart"/>
-            <w:r>
-              <w:rPr>
-                <w:rFonts w:ascii="Arial" w:hAnsi="Arial" w:cs="Arial"/>
-                <w:bCs/>
-                <w:color w:val="000000"/>
-                <w:sz w:val="18"/>
-                <w:szCs w:val="18"/>
-                <w:shd w:val="clear" w:color="auto" w:fill="FFFFFF"/>
-              </w:rPr>
-              <w:t>Docker</w:t>
-            </w:r>
-            <w:proofErr w:type="spellEnd"/>
-            <w:r>
-              <w:rPr>
-                <w:rFonts w:ascii="Arial" w:hAnsi="Arial" w:cs="Arial"/>
-                <w:bCs/>
-                <w:color w:val="000000"/>
-                <w:sz w:val="18"/>
-                <w:szCs w:val="18"/>
-                <w:shd w:val="clear" w:color="auto" w:fill="FFFFFF"/>
-              </w:rPr>
-              <w:t xml:space="preserve"> Engine, images, containers, </w:t>
-            </w:r>
-            <w:proofErr w:type="spellStart"/>
-            <w:r>
-              <w:rPr>
-                <w:rFonts w:ascii="Arial" w:hAnsi="Arial" w:cs="Arial"/>
-                <w:bCs/>
-                <w:color w:val="000000"/>
-                <w:sz w:val="18"/>
-                <w:szCs w:val="18"/>
-                <w:shd w:val="clear" w:color="auto" w:fill="FFFFFF"/>
-              </w:rPr>
-              <w:t>Docker</w:t>
-            </w:r>
-            <w:proofErr w:type="spellEnd"/>
-            <w:r>
-              <w:rPr>
-                <w:rFonts w:ascii="Arial" w:hAnsi="Arial" w:cs="Arial"/>
-                <w:bCs/>
-                <w:color w:val="000000"/>
-                <w:sz w:val="18"/>
-                <w:szCs w:val="18"/>
-                <w:shd w:val="clear" w:color="auto" w:fill="FFFFFF"/>
-              </w:rPr>
-              <w:t xml:space="preserve"> Hub registry, </w:t>
-            </w:r>
-            <w:proofErr w:type="spellStart"/>
-            <w:r>
-              <w:rPr>
-                <w:rFonts w:ascii="Arial" w:hAnsi="Arial" w:cs="Arial"/>
-                <w:bCs/>
-                <w:color w:val="000000"/>
-                <w:sz w:val="18"/>
-                <w:szCs w:val="18"/>
-                <w:shd w:val="clear" w:color="auto" w:fill="FFFFFF"/>
-              </w:rPr>
-              <w:t>Dockerfile</w:t>
-            </w:r>
-            <w:proofErr w:type="spellEnd"/>
-            <w:r>
-              <w:rPr>
-                <w:rFonts w:ascii="Arial" w:hAnsi="Arial" w:cs="Arial"/>
-                <w:bCs/>
-                <w:color w:val="000000"/>
-                <w:sz w:val="18"/>
-                <w:szCs w:val="18"/>
-                <w:shd w:val="clear" w:color="auto" w:fill="FFFFFF"/>
-              </w:rPr>
-              <w:t xml:space="preserve">. </w:t>
-            </w:r>
-            <w:proofErr w:type="spellStart"/>
-            <w:r>
-              <w:rPr>
-                <w:rFonts w:ascii="Arial" w:hAnsi="Arial" w:cs="Arial"/>
-                <w:bCs/>
-                <w:color w:val="000000"/>
-                <w:sz w:val="18"/>
-                <w:szCs w:val="18"/>
-                <w:shd w:val="clear" w:color="auto" w:fill="FFFFFF"/>
-              </w:rPr>
-              <w:t>Dockerfile</w:t>
-            </w:r>
-            <w:proofErr w:type="spellEnd"/>
-            <w:r>
-              <w:rPr>
-                <w:rFonts w:ascii="Arial" w:hAnsi="Arial" w:cs="Arial"/>
-                <w:bCs/>
-                <w:color w:val="000000"/>
-                <w:sz w:val="18"/>
-                <w:szCs w:val="18"/>
-                <w:shd w:val="clear" w:color="auto" w:fill="FFFFFF"/>
-              </w:rPr>
-              <w:t xml:space="preserve"> basics: FROM, COPY, RUN, EXPOSE, CMD. Building and running images: </w:t>
-            </w:r>
-            <w:proofErr w:type="spellStart"/>
-            <w:r>
-              <w:rPr>
-                <w:rFonts w:ascii="Arial" w:hAnsi="Arial" w:cs="Arial"/>
-                <w:bCs/>
-                <w:color w:val="000000"/>
-                <w:sz w:val="18"/>
-                <w:szCs w:val="18"/>
-                <w:shd w:val="clear" w:color="auto" w:fill="FFFFFF"/>
-              </w:rPr>
-              <w:t>docker</w:t>
-            </w:r>
-            <w:proofErr w:type="spellEnd"/>
-            <w:r>
-              <w:rPr>
-                <w:rFonts w:ascii="Arial" w:hAnsi="Arial" w:cs="Arial"/>
-                <w:bCs/>
-                <w:color w:val="000000"/>
-                <w:sz w:val="18"/>
-                <w:szCs w:val="18"/>
-                <w:shd w:val="clear" w:color="auto" w:fill="FFFFFF"/>
-              </w:rPr>
-              <w:t xml:space="preserve"> build, </w:t>
-            </w:r>
-            <w:proofErr w:type="spellStart"/>
-            <w:r>
-              <w:rPr>
-                <w:rFonts w:ascii="Arial" w:hAnsi="Arial" w:cs="Arial"/>
-                <w:bCs/>
-                <w:color w:val="000000"/>
-                <w:sz w:val="18"/>
-                <w:szCs w:val="18"/>
-                <w:shd w:val="clear" w:color="auto" w:fill="FFFFFF"/>
-              </w:rPr>
-              <w:t>docker</w:t>
-            </w:r>
-            <w:proofErr w:type="spellEnd"/>
-            <w:r>
-              <w:rPr>
-                <w:rFonts w:ascii="Arial" w:hAnsi="Arial" w:cs="Arial"/>
-                <w:bCs/>
-                <w:color w:val="000000"/>
-                <w:sz w:val="18"/>
-                <w:szCs w:val="18"/>
-                <w:shd w:val="clear" w:color="auto" w:fill="FFFFFF"/>
-              </w:rPr>
-              <w:t xml:space="preserve"> run, port mapping, environment variables. </w:t>
-            </w:r>
-            <w:proofErr w:type="spellStart"/>
-            <w:r>
-              <w:rPr>
-                <w:rFonts w:ascii="Arial" w:hAnsi="Arial" w:cs="Arial"/>
-                <w:bCs/>
-                <w:color w:val="000000"/>
-                <w:sz w:val="18"/>
-                <w:szCs w:val="18"/>
-                <w:shd w:val="clear" w:color="auto" w:fill="FFFFFF"/>
-              </w:rPr>
-              <w:t>Docker</w:t>
-            </w:r>
-            <w:proofErr w:type="spellEnd"/>
-            <w:r>
-              <w:rPr>
-                <w:rFonts w:ascii="Arial" w:hAnsi="Arial" w:cs="Arial"/>
-                <w:bCs/>
-                <w:color w:val="000000"/>
-                <w:sz w:val="18"/>
-                <w:szCs w:val="18"/>
-                <w:shd w:val="clear" w:color="auto" w:fill="FFFFFF"/>
-              </w:rPr>
-              <w:t xml:space="preserve"> Compose. Container networking. Container orchestration concepts. </w:t>
-            </w:r>
-            <w:proofErr w:type="spellStart"/>
-            <w:r>
-              <w:rPr>
-                <w:rFonts w:ascii="Arial" w:hAnsi="Arial" w:cs="Arial"/>
-                <w:bCs/>
-                <w:color w:val="000000"/>
-                <w:sz w:val="18"/>
-                <w:szCs w:val="18"/>
-                <w:shd w:val="clear" w:color="auto" w:fill="FFFFFF"/>
-              </w:rPr>
-              <w:t>Docker</w:t>
-            </w:r>
-            <w:proofErr w:type="spellEnd"/>
-            <w:r>
-              <w:rPr>
-                <w:rFonts w:ascii="Arial" w:hAnsi="Arial" w:cs="Arial"/>
-                <w:bCs/>
-                <w:color w:val="000000"/>
-                <w:sz w:val="18"/>
-                <w:szCs w:val="18"/>
-                <w:shd w:val="clear" w:color="auto" w:fill="FFFFFF"/>
-              </w:rPr>
-              <w:t xml:space="preserve"> in the development workflow. CI/CD concepts: Continuous Integration, Continuous Delivery, Continuous Deployment. CI pipeline stages. CD pipeline stages. </w:t>
-            </w:r>
-            <w:proofErr w:type="spellStart"/>
-            <w:r>
-              <w:rPr>
-                <w:rFonts w:ascii="Arial" w:hAnsi="Arial" w:cs="Arial"/>
-                <w:bCs/>
-                <w:color w:val="000000"/>
-                <w:sz w:val="18"/>
-                <w:szCs w:val="18"/>
-                <w:shd w:val="clear" w:color="auto" w:fill="FFFFFF"/>
-              </w:rPr>
-              <w:t>GitHub</w:t>
-            </w:r>
-            <w:proofErr w:type="spellEnd"/>
-            <w:r>
-              <w:rPr>
-                <w:rFonts w:ascii="Arial" w:hAnsi="Arial" w:cs="Arial"/>
-                <w:bCs/>
-                <w:color w:val="000000"/>
-                <w:sz w:val="18"/>
-                <w:szCs w:val="18"/>
-                <w:shd w:val="clear" w:color="auto" w:fill="FFFFFF"/>
-              </w:rPr>
-              <w:t xml:space="preserve"> Actions. </w:t>
-            </w:r>
-            <w:proofErr w:type="spellStart"/>
-            <w:r>
-              <w:rPr>
-                <w:rFonts w:ascii="Arial" w:hAnsi="Arial" w:cs="Arial"/>
-                <w:bCs/>
-                <w:color w:val="000000"/>
-                <w:sz w:val="18"/>
-                <w:szCs w:val="18"/>
-                <w:shd w:val="clear" w:color="auto" w:fill="FFFFFF"/>
-              </w:rPr>
-              <w:t>Containerised</w:t>
-            </w:r>
-            <w:proofErr w:type="spellEnd"/>
-            <w:r>
-              <w:rPr>
-                <w:rFonts w:ascii="Arial" w:hAnsi="Arial" w:cs="Arial"/>
-                <w:bCs/>
-                <w:color w:val="000000"/>
-                <w:sz w:val="18"/>
-                <w:szCs w:val="18"/>
-                <w:shd w:val="clear" w:color="auto" w:fill="FFFFFF"/>
-              </w:rPr>
-              <w:t xml:space="preserve"> CI/CD. Deployment strategies: blue-green, canary, rolling updates. Environment management. </w:t>
-            </w:r>
-            <w:proofErr w:type="spellStart"/>
-            <w:r>
-              <w:rPr>
-                <w:rFonts w:ascii="Arial" w:hAnsi="Arial" w:cs="Arial"/>
-                <w:bCs/>
-                <w:color w:val="000000"/>
-                <w:sz w:val="18"/>
-                <w:szCs w:val="18"/>
-                <w:shd w:val="clear" w:color="auto" w:fill="FFFFFF"/>
-              </w:rPr>
-              <w:t>DevOps</w:t>
-            </w:r>
-            <w:proofErr w:type="spellEnd"/>
-            <w:r>
-              <w:rPr>
-                <w:rFonts w:ascii="Arial" w:hAnsi="Arial" w:cs="Arial"/>
-                <w:bCs/>
-                <w:color w:val="000000"/>
-                <w:sz w:val="18"/>
-                <w:szCs w:val="18"/>
-                <w:shd w:val="clear" w:color="auto" w:fill="FFFFFF"/>
-              </w:rPr>
-              <w:t xml:space="preserve"> culture and observability basics.</w:t>
+              <w:t xml:space="preserve"> CI/CD. Deployment strategies: blue-green, canary, rolling updates. Environment management. DevOps culture and observability basics.</w:t>
             </w:r>
           </w:p>
           <w:p>
@@ -5254,16 +4631,7 @@
           <w:szCs w:val="18"/>
         </w:rPr>
         <w:lastRenderedPageBreak/>
-        <w:t>Textbo</w:t>
-      </w:r>
-      <w:bookmarkStart w:id="0" w:name="_GoBack"/>
-      <w:bookmarkEnd w:id="0"/>
-      <w:r>
-        <w:rPr>
-          <w:sz w:val="18"/>
-          <w:szCs w:val="18"/>
-        </w:rPr>
-        <w:t>oks</w:t>
+        <w:t>Textbooks</w:t>
       </w:r>
     </w:p>
     <w:p>
@@ -5392,23 +4760,13 @@
         </w:rPr>
         <w:t xml:space="preserve">Leonard Richardson &amp; Mike Amundsen — </w:t>
       </w:r>
-      <w:proofErr w:type="spellStart"/>
       <w:r>
         <w:rPr>
           <w:b/>
           <w:sz w:val="18"/>
           <w:szCs w:val="18"/>
         </w:rPr>
-        <w:t>RESTful</w:t>
-      </w:r>
-      <w:proofErr w:type="spellEnd"/>
-      <w:r>
-        <w:rPr>
-          <w:b/>
-          <w:sz w:val="18"/>
-          <w:szCs w:val="18"/>
-        </w:rPr>
-        <w:t xml:space="preserve"> Web APIs</w:t>
+        <w:t>RESTful Web APIs</w:t>
       </w:r>
       <w:r>
         <w:rPr>
@@ -5453,25 +4811,8 @@
           <w:sz w:val="18"/>
           <w:szCs w:val="18"/>
         </w:rPr>
-        <w:t xml:space="preserve">Nigel </w:t>
+        <w:t xml:space="preserve">Nigel Poulton — </w:t>
       </w:r>
-      <w:proofErr w:type="spellStart"/>
-      <w:r>
-        <w:rPr>
-          <w:sz w:val="18"/>
-          <w:szCs w:val="18"/>
-        </w:rPr>
-        <w:t>Poulton</w:t>
-      </w:r>
-      <w:proofErr w:type="spellEnd"/>
-      <w:r>
-        <w:rPr>
-          <w:sz w:val="18"/>
-          <w:szCs w:val="18"/>
-        </w:rPr>
-        <w:t xml:space="preserve"> — </w:t>
-      </w:r>
-      <w:proofErr w:type="spellStart"/>
       <w:r>
         <w:rPr>
           <w:b/>
@@ -5479,17 +4820,7 @@
           <w:sz w:val="18"/>
           <w:szCs w:val="18"/>
         </w:rPr>
-        <w:t>Docker</w:t>
-      </w:r>
-      <w:proofErr w:type="spellEnd"/>
-      <w:r>
-        <w:rPr>
-          <w:b/>
-          <w:i/>
-          <w:sz w:val="18"/>
-          <w:szCs w:val="18"/>
-        </w:rPr>
-        <w:t xml:space="preserve"> Deep Dive</w:t>
+        <w:t>Docker Deep Dive</w:t>
       </w:r>
       <w:r>
         <w:rPr>
@@ -5526,8 +4857,8 @@
 </file>
 
 <file path=word/numbering.xml><?xml version="1.0" encoding="utf-8"?>
-<w:numbering xmlns:wpc="http://schemas.microsoft.com/office/word/2010/wordprocessingCanvas" xmlns:mc="http://schemas.openxmlformats.org/markup-compatibility/2006" xmlns:o="urn:schemas-microsoft-com:office:office" xmlns:r="http://schemas.openxmlformats.org/officeDocument/2006/relationships" xmlns:m="http://schemas.openxmlformats.org/officeDocument/2006/math" xmlns:v="urn:schemas-microsoft-com:vml" xmlns:wp14="http://schemas.microsoft.com/office/word/2010/wordprocessingDrawing" xmlns:wp="http://schemas.openxmlformats.org/drawingml/2006/wordprocessingDrawing" xmlns:w10="urn:schemas-microsoft-com:office:word" xmlns:w="http://schemas.openxmlformats.org/wordprocessingml/2006/main" xmlns:w14="http://schemas.microsoft.com/office/word/2010/wordml" xmlns:w15="http://schemas.microsoft.com/office/word/2012/wordml" xmlns:wpg="http://schemas.microsoft.com/office/word/2010/wordprocessingGroup" xmlns:wpi="http://schemas.microsoft.com/office/word/2010/wordprocessingInk" xmlns:wne="http://schemas.microsoft.com/office/word/2006/wordml" xmlns:wps="http://schemas.microsoft.com/office/word/2010/wordprocessingShape" mc:Ignorable="w14 w15 wp14">
-  <w:abstractNum w:abstractNumId="0">
+<w:numbering xmlns:wpc="http://schemas.microsoft.com/office/word/2010/wordprocessingCanvas" xmlns:cx="http://schemas.microsoft.com/office/drawing/2014/chartex" xmlns:cx1="http://schemas.microsoft.com/office/drawing/2015/9/8/chartex" xmlns:cx2="http://schemas.microsoft.com/office/drawing/2015/10/21/chartex" xmlns:cx3="http://schemas.microsoft.com/office/drawing/2016/5/9/chartex" xmlns:cx4="http://schemas.microsoft.com/office/drawing/2016/5/10/chartex" xmlns:cx5="http://schemas.microsoft.com/office/drawing/2016/5/11/chartex" xmlns:cx6="http://schemas.microsoft.com/office/drawing/2016/5/12/chartex" xmlns:cx7="http://schemas.microsoft.com/office/drawing/2016/5/13/chartex" xmlns:cx8="http://schemas.microsoft.com/office/drawing/2016/5/14/chartex" xmlns:mc="http://schemas.openxmlformats.org/markup-compatibility/2006" xmlns:m="http://schemas.openxmlformats.org/officeDocument/2006/math" xmlns:aink="http://schemas.microsoft.com/office/drawing/2016/ink" xmlns:am3d="http://schemas.microsoft.com/office/drawing/2017/model3d" xmlns:oel="http://schemas.microsoft.com/office/2019/extlst" xmlns:r="http://schemas.openxmlformats.org/officeDocument/2006/relationships" xmlns:wp14="http://schemas.microsoft.com/office/word/2010/wordprocessingDrawing" xmlns:wp="http://schemas.openxmlformats.org/drawingml/2006/wordprocessingDrawing" xmlns:wpg="http://schemas.microsoft.com/office/word/2010/wordprocessingGroup" xmlns:wpi="http://schemas.microsoft.com/office/word/2010/wordprocessingInk" xmlns:wps="http://schemas.microsoft.com/office/word/2010/wordprocessingShape" xmlns:o="urn:schemas-microsoft-com:office:office" xmlns:v="urn:schemas-microsoft-com:vml" xmlns:w10="urn:schemas-microsoft-com:office:word" xmlns:w="http://schemas.openxmlformats.org/wordprocessingml/2006/main" xmlns:w14="http://schemas.microsoft.com/office/word/2010/wordml" xmlns:w15="http://schemas.microsoft.com/office/word/2012/wordml" xmlns:w16cex="http://schemas.microsoft.com/office/word/2018/wordml/cex" xmlns:w16cid="http://schemas.microsoft.com/office/word/2016/wordml/cid" xmlns:w16="http://schemas.microsoft.com/office/word/2018/wordml" xmlns:w16sdtdh="http://schemas.microsoft.com/office/word/2020/wordml/sdtdatahash" xmlns:w16sdtfl="http://schemas.microsoft.com/office/word/2024/wordml/sdtformatlock" xmlns:w16se="http://schemas.microsoft.com/office/word/2015/wordml/symex" xmlns:w16du="http://schemas.microsoft.com/office/word/2023/wordml/word16du" xmlns:wne="http://schemas.microsoft.com/office/word/2006/wordml" mc:Ignorable="w14 w15 w16se w16cid w16 w16cex w16sdtdh w16sdtfl w16du wp14">
+  <w:abstractNum w:abstractNumId="0" w15:restartNumberingAfterBreak="0">
     <w:nsid w:val="FFFFFF88"/>
     <w:multiLevelType w:val="singleLevel"/>
     <w:tmpl w:val="A27C12A4"/>
@@ -5545,14 +4876,14 @@
       </w:pPr>
     </w:lvl>
   </w:abstractNum>
-  <w:num w:numId="1">
+  <w:num w:numId="1" w16cid:durableId="1989355099">
     <w:abstractNumId w:val="0"/>
   </w:num>
 </w:numbering>
 </file>
 
 <file path=word/styles.xml><?xml version="1.0" encoding="utf-8"?>
-<w:styles xmlns:mc="http://schemas.openxmlformats.org/markup-compatibility/2006" xmlns:r="http://schemas.openxmlformats.org/officeDocument/2006/relationships" xmlns:w="http://schemas.openxmlformats.org/wordprocessingml/2006/main" xmlns:w14="http://schemas.microsoft.com/office/word/2010/wordml" xmlns:w15="http://schemas.microsoft.com/office/word/2012/wordml" mc:Ignorable="w14 w15">
+<w:styles xmlns:mc="http://schemas.openxmlformats.org/markup-compatibility/2006" xmlns:r="http://schemas.openxmlformats.org/officeDocument/2006/relationships" xmlns:w="http://schemas.openxmlformats.org/wordprocessingml/2006/main" xmlns:w14="http://schemas.microsoft.com/office/word/2010/wordml" xmlns:w15="http://schemas.microsoft.com/office/word/2012/wordml" xmlns:w16cex="http://schemas.microsoft.com/office/word/2018/wordml/cex" xmlns:w16cid="http://schemas.microsoft.com/office/word/2016/wordml/cid" xmlns:w16="http://schemas.microsoft.com/office/word/2018/wordml" xmlns:w16sdtdh="http://schemas.microsoft.com/office/word/2020/wordml/sdtdatahash" xmlns:w16sdtfl="http://schemas.microsoft.com/office/word/2024/wordml/sdtformatlock" xmlns:w16se="http://schemas.microsoft.com/office/word/2015/wordml/symex" xmlns:w16du="http://schemas.microsoft.com/office/word/2023/wordml/word16du" mc:Ignorable="w14 w15 w16se w16cid w16 w16cex w16sdtdh w16sdtfl w16du">
   <w:docDefaults>
     <w:rPrDefault>
       <w:rPr>
@@ -5568,7 +4899,7 @@
       </w:pPr>
     </w:pPrDefault>
   </w:docDefaults>
-  <w:latentStyles w:defLockedState="0" w:defUIPriority="99" w:defSemiHidden="0" w:defUnhideWhenUsed="0" w:defQFormat="0" w:count="371">
+  <w:latentStyles w:defLockedState="0" w:defUIPriority="99" w:defSemiHidden="0" w:defUnhideWhenUsed="0" w:defQFormat="0" w:count="376">
     <w:lsdException w:name="Normal" w:uiPriority="0" w:qFormat="1"/>
     <w:lsdException w:name="heading 1" w:uiPriority="9" w:qFormat="1"/>
     <w:lsdException w:name="heading 2" w:semiHidden="1" w:uiPriority="9" w:unhideWhenUsed="1" w:qFormat="1"/>
@@ -5940,6 +5271,11 @@
     <w:lsdException w:name="List Table 5 Dark Accent 6" w:uiPriority="50"/>
     <w:lsdException w:name="List Table 6 Colorful Accent 6" w:uiPriority="51"/>
     <w:lsdException w:name="List Table 7 Colorful Accent 6" w:uiPriority="52"/>
+    <w:lsdException w:name="Mention" w:semiHidden="1" w:unhideWhenUsed="1"/>
+    <w:lsdException w:name="Smart Hyperlink" w:semiHidden="1" w:unhideWhenUsed="1"/>
+    <w:lsdException w:name="Hashtag" w:semiHidden="1" w:unhideWhenUsed="1"/>
+    <w:lsdException w:name="Unresolved Mention" w:semiHidden="1" w:unhideWhenUsed="1"/>
+    <w:lsdException w:name="Smart Link" w:semiHidden="1" w:unhideWhenUsed="1"/>
   </w:latentStyles>
   <w:style w:type="paragraph" w:default="1" w:styleId="Normal">
     <w:name w:val="Normal"/>
@@ -5996,7 +5332,6 @@
       <w:lang w:bidi="bn-BD"/>
     </w:rPr>
     <w:tblPr>
-      <w:tblInd w:w="0" w:type="dxa"/>
       <w:tblBorders>
         <w:top w:val="single" w:sz="4" w:space="0" w:color="auto"/>
         <w:left w:val="single" w:sz="4" w:space="0" w:color="auto"/>
@@ -6005,12 +5340,6 @@
         <w:insideH w:val="single" w:sz="4" w:space="0" w:color="auto"/>
         <w:insideV w:val="single" w:sz="4" w:space="0" w:color="auto"/>
       </w:tblBorders>
-      <w:tblCellMar>
-        <w:top w:w="0" w:type="dxa"/>
-        <w:left w:w="108" w:type="dxa"/>
-        <w:bottom w:w="0" w:type="dxa"/>
-        <w:right w:w="108" w:type="dxa"/>
-      </w:tblCellMar>
     </w:tblPr>
   </w:style>
   <w:style w:type="paragraph" w:styleId="ListParagraph">

</xml_diff>

<commit_message>
Assess CSE 3251 CO3 and CO4 in the final exam
Re-tick Final Exam for CO3 and CO4 so every CO is covered by the 70%
final, and untick Presentation for CO4 since the theory marks split has
no presentation component. Mirrored in both markdown copies.
</commit_message>
<xml_diff>
--- a/57-CSE 3251_U.docx
+++ b/57-CSE 3251_U.docx
@@ -2814,7 +2814,7 @@
                         <w:sz w:val="18"/>
                         <w:szCs w:val="18"/>
                       </w:rPr>
-                      <w:t>☐</w:t>
+                      <w:t>☒</w:t>
                     </w:r>
                   </w:sdtContent>
                 </w:sdt>
@@ -3537,7 +3537,7 @@
                         <w:sz w:val="18"/>
                         <w:szCs w:val="18"/>
                       </w:rPr>
-                      <w:t>☐</w:t>
+                      <w:t>☒</w:t>
                     </w:r>
                   </w:sdtContent>
                 </w:sdt>
@@ -3689,7 +3689,7 @@
                         <w:sz w:val="18"/>
                         <w:szCs w:val="18"/>
                       </w:rPr>
-                      <w:t>☒</w:t>
+                      <w:t>☐</w:t>
                     </w:r>
                   </w:sdtContent>
                 </w:sdt>

</xml_diff>

<commit_message>
Use a pyramid verb for CSE 3251 CO1 and fix its prerequisite title
CO1 now uses "examine" (L4) from the cognitive pyramid's verb list in
place of the level name "analyse". The prerequisite reads
"User Interface Development Lab", the course's actual title.
</commit_message>
<xml_diff>
--- a/57-CSE 3251_U.docx
+++ b/57-CSE 3251_U.docx
@@ -305,7 +305,7 @@
                 <w:sz w:val="18"/>
                 <w:szCs w:val="18"/>
               </w:rPr>
-              <w:t>User Interface Development, CSE3141: Computer Networks</w:t>
+              <w:t>User Interface Development Lab, CSE3141: Computer Networks</w:t>
             </w:r>
           </w:p>
         </w:tc>
@@ -920,7 +920,7 @@
                 <w:sz w:val="18"/>
                 <w:szCs w:val="18"/>
               </w:rPr>
-              <w:t>analyse</w:t>
+              <w:t>examine</w:t>
             </w:r>
             <w:proofErr w:type="spellEnd"/>
             <w:r>

</xml_diff>